<commit_message>
fix(bp): obsah sa generuje z dokumentu, nie zo šablóny
Obsah je pole TOC a v šablóne mal uložený jej vlastný výsledok — po otvorení
dokumentu sa preto zobrazovali položky „Nadpis 1“, „Nadpis 2“ a „[Rozvedení
diplomového (bakalářského) úkolu po kapitolách]“ namiesto skutočných kapitol.

Uložený výsledok je nahradený čistým poľom s w:dirty a do settings.xml pribudlo
updateFields, takže Word obsah prepočíta hneď pri otvorení.

Co-Authored-By: Claude Opus 5 <noreply@anthropic.com>
</commit_message>
<xml_diff>
--- a/docs/Bakalarska_praca_Serafin.docx
+++ b/docs/Bakalarska_praca_Serafin.docx
@@ -303,21 +303,9 @@
     <w:p>
       <w:pPr>
         <w:pStyle w:val="Obsah1"/>
-        <w:tabs>
-          <w:tab w:val="left" w:pos="480"/>
-          <w:tab w:val="right" w:leader="dot" w:pos="8493"/>
-        </w:tabs>
-        <w:rPr>
-          <w:rFonts w:asciiTheme="minorHAnsi" w:eastAsiaTheme="minorEastAsia" w:hAnsiTheme="minorHAnsi" w:cstheme="minorBidi"/>
-          <w:noProof/>
-          <w:kern w:val="2"/>
-          <w:szCs w:val="24"/>
-          <w:lang w:eastAsia="cs-CZ"/>
-          <w14:ligatures w14:val="standardContextual"/>
-        </w:rPr>
-      </w:pPr>
-      <w:r>
-        <w:fldChar w:fldCharType="begin"/>
+      </w:pPr>
+      <w:r>
+        <w:fldChar w:fldCharType="begin" w:dirty="true"/>
       </w:r>
       <w:r>
         <w:instrText xml:space="preserve"> TOC \o "2-3" \h \z \t "Nadpis 1;1;Nadpis bez čísla;1" </w:instrText>
@@ -325,806 +313,27 @@
       <w:r>
         <w:fldChar w:fldCharType="separate"/>
       </w:r>
-      <w:hyperlink w:anchor="_Toc239761725" w:history="1">
-        <w:r>
-          <w:rPr>
-            <w:rStyle w:val="Hypertextovodkaz"/>
-            <w:noProof/>
-          </w:rPr>
-          <w:t>1</w:t>
-        </w:r>
-        <w:r>
-          <w:rPr>
-            <w:rFonts w:asciiTheme="minorHAnsi" w:eastAsiaTheme="minorEastAsia" w:hAnsiTheme="minorHAnsi" w:cstheme="minorBidi"/>
-            <w:noProof/>
-            <w:kern w:val="2"/>
-            <w:szCs w:val="24"/>
-            <w:lang w:eastAsia="cs-CZ"/>
-            <w14:ligatures w14:val="standardContextual"/>
-          </w:rPr>
-          <w:tab/>
-        </w:r>
-        <w:r>
-          <w:rPr>
-            <w:rStyle w:val="Hypertextovodkaz"/>
-            <w:noProof/>
-          </w:rPr>
-          <w:t>Úvod</w:t>
-        </w:r>
-        <w:r>
-          <w:rPr>
-            <w:noProof/>
-            <w:webHidden/>
-          </w:rPr>
-          <w:tab/>
-        </w:r>
-        <w:r>
-          <w:rPr>
-            <w:noProof/>
-            <w:webHidden/>
-          </w:rPr>
-          <w:fldChar w:fldCharType="begin"/>
-        </w:r>
-        <w:r>
-          <w:rPr>
-            <w:noProof/>
-            <w:webHidden/>
-          </w:rPr>
-          <w:instrText xml:space="preserve"> PAGEREF _Toc239761725 \h </w:instrText>
-        </w:r>
-        <w:r>
-          <w:rPr>
-            <w:noProof/>
-            <w:webHidden/>
-          </w:rPr>
-        </w:r>
-        <w:r>
-          <w:rPr>
-            <w:noProof/>
-            <w:webHidden/>
-          </w:rPr>
-          <w:fldChar w:fldCharType="separate"/>
-        </w:r>
-        <w:r>
-          <w:rPr>
-            <w:noProof/>
-            <w:webHidden/>
-          </w:rPr>
-          <w:t>3</w:t>
-        </w:r>
-        <w:r>
-          <w:rPr>
-            <w:noProof/>
-            <w:webHidden/>
-          </w:rPr>
-          <w:fldChar w:fldCharType="end"/>
-        </w:r>
-      </w:hyperlink>
+      <w:r>
+        <w:t xml:space="preserve">Obsah sa vygeneruje po kliknutí pravým tlačidlom → Aktualizovať pole.</w:t>
+      </w:r>
+      <w:r>
+        <w:fldChar w:fldCharType="end"/>
+      </w:r>
     </w:p>
     <w:p>
       <w:pPr>
         <w:pStyle w:val="Obsah1"/>
-        <w:tabs>
-          <w:tab w:val="left" w:pos="480"/>
-          <w:tab w:val="right" w:leader="dot" w:pos="8493"/>
-        </w:tabs>
-        <w:rPr>
-          <w:rFonts w:asciiTheme="minorHAnsi" w:eastAsiaTheme="minorEastAsia" w:hAnsiTheme="minorHAnsi" w:cstheme="minorBidi"/>
-          <w:noProof/>
-          <w:kern w:val="2"/>
-          <w:szCs w:val="24"/>
-          <w:lang w:eastAsia="cs-CZ"/>
-          <w14:ligatures w14:val="standardContextual"/>
-        </w:rPr>
-      </w:pPr>
-      <w:hyperlink w:anchor="_Toc239761726" w:history="1">
-        <w:r>
-          <w:rPr>
-            <w:rStyle w:val="Hypertextovodkaz"/>
-            <w:noProof/>
-          </w:rPr>
-          <w:t>2</w:t>
-        </w:r>
-        <w:r>
-          <w:rPr>
-            <w:rFonts w:asciiTheme="minorHAnsi" w:eastAsiaTheme="minorEastAsia" w:hAnsiTheme="minorHAnsi" w:cstheme="minorBidi"/>
-            <w:noProof/>
-            <w:kern w:val="2"/>
-            <w:szCs w:val="24"/>
-            <w:lang w:eastAsia="cs-CZ"/>
-            <w14:ligatures w14:val="standardContextual"/>
-          </w:rPr>
-          <w:tab/>
-        </w:r>
-        <w:r>
-          <w:rPr>
-            <w:rStyle w:val="Hypertextovodkaz"/>
-            <w:noProof/>
-          </w:rPr>
-          <w:t>[Rozvedení diplomového (bakalářského) úkolu po kapitolách]</w:t>
-        </w:r>
-        <w:r>
-          <w:rPr>
-            <w:noProof/>
-            <w:webHidden/>
-          </w:rPr>
-          <w:tab/>
-        </w:r>
-        <w:r>
-          <w:rPr>
-            <w:noProof/>
-            <w:webHidden/>
-          </w:rPr>
-          <w:fldChar w:fldCharType="begin"/>
-        </w:r>
-        <w:r>
-          <w:rPr>
-            <w:noProof/>
-            <w:webHidden/>
-          </w:rPr>
-          <w:instrText xml:space="preserve"> PAGEREF _Toc239761726 \h </w:instrText>
-        </w:r>
-        <w:r>
-          <w:rPr>
-            <w:noProof/>
-            <w:webHidden/>
-          </w:rPr>
-        </w:r>
-        <w:r>
-          <w:rPr>
-            <w:noProof/>
-            <w:webHidden/>
-          </w:rPr>
-          <w:fldChar w:fldCharType="separate"/>
-        </w:r>
-        <w:r>
-          <w:rPr>
-            <w:noProof/>
-            <w:webHidden/>
-          </w:rPr>
-          <w:t>4</w:t>
-        </w:r>
-        <w:r>
-          <w:rPr>
-            <w:noProof/>
-            <w:webHidden/>
-          </w:rPr>
-          <w:fldChar w:fldCharType="end"/>
-        </w:r>
-      </w:hyperlink>
-    </w:p>
-    <w:p>
-      <w:pPr>
-        <w:pStyle w:val="Obsah2"/>
-        <w:tabs>
-          <w:tab w:val="left" w:pos="960"/>
-          <w:tab w:val="right" w:leader="dot" w:pos="8493"/>
-        </w:tabs>
-        <w:rPr>
-          <w:rFonts w:asciiTheme="minorHAnsi" w:eastAsiaTheme="minorEastAsia" w:hAnsiTheme="minorHAnsi" w:cstheme="minorBidi"/>
-          <w:noProof/>
-          <w:kern w:val="2"/>
-          <w:szCs w:val="24"/>
-          <w:lang w:eastAsia="cs-CZ"/>
-          <w14:ligatures w14:val="standardContextual"/>
-        </w:rPr>
-      </w:pPr>
-      <w:hyperlink w:anchor="_Toc239761727" w:history="1">
-        <w:r>
-          <w:rPr>
-            <w:rStyle w:val="Hypertextovodkaz"/>
-            <w:noProof/>
-          </w:rPr>
-          <w:t>2.1</w:t>
-        </w:r>
-        <w:r>
-          <w:rPr>
-            <w:rFonts w:asciiTheme="minorHAnsi" w:eastAsiaTheme="minorEastAsia" w:hAnsiTheme="minorHAnsi" w:cstheme="minorBidi"/>
-            <w:noProof/>
-            <w:kern w:val="2"/>
-            <w:szCs w:val="24"/>
-            <w:lang w:eastAsia="cs-CZ"/>
-            <w14:ligatures w14:val="standardContextual"/>
-          </w:rPr>
-          <w:tab/>
-        </w:r>
-        <w:r>
-          <w:rPr>
-            <w:rStyle w:val="Hypertextovodkaz"/>
-            <w:noProof/>
-          </w:rPr>
-          <w:t>[Podkapitola rozvedení diplomového (bakalářského) úkolu]</w:t>
-        </w:r>
-        <w:r>
-          <w:rPr>
-            <w:noProof/>
-            <w:webHidden/>
-          </w:rPr>
-          <w:tab/>
-        </w:r>
-        <w:r>
-          <w:rPr>
-            <w:noProof/>
-            <w:webHidden/>
-          </w:rPr>
-          <w:fldChar w:fldCharType="begin"/>
-        </w:r>
-        <w:r>
-          <w:rPr>
-            <w:noProof/>
-            <w:webHidden/>
-          </w:rPr>
-          <w:instrText xml:space="preserve"> PAGEREF _Toc239761727 \h </w:instrText>
-        </w:r>
-        <w:r>
-          <w:rPr>
-            <w:noProof/>
-            <w:webHidden/>
-          </w:rPr>
-        </w:r>
-        <w:r>
-          <w:rPr>
-            <w:noProof/>
-            <w:webHidden/>
-          </w:rPr>
-          <w:fldChar w:fldCharType="separate"/>
-        </w:r>
-        <w:r>
-          <w:rPr>
-            <w:noProof/>
-            <w:webHidden/>
-          </w:rPr>
-          <w:t>4</w:t>
-        </w:r>
-        <w:r>
-          <w:rPr>
-            <w:noProof/>
-            <w:webHidden/>
-          </w:rPr>
-          <w:fldChar w:fldCharType="end"/>
-        </w:r>
-      </w:hyperlink>
+      </w:pPr>
+      <w:r>
+        <w:t xml:space="preserve">Seznam příloh</w:t>
+      </w:r>
     </w:p>
     <w:p>
       <w:pPr>
         <w:pStyle w:val="Obsah1"/>
-        <w:tabs>
-          <w:tab w:val="left" w:pos="480"/>
-          <w:tab w:val="right" w:leader="dot" w:pos="8493"/>
-        </w:tabs>
-        <w:rPr>
-          <w:rFonts w:asciiTheme="minorHAnsi" w:eastAsiaTheme="minorEastAsia" w:hAnsiTheme="minorHAnsi" w:cstheme="minorBidi"/>
-          <w:noProof/>
-          <w:kern w:val="2"/>
-          <w:szCs w:val="24"/>
-          <w:lang w:eastAsia="cs-CZ"/>
-          <w14:ligatures w14:val="standardContextual"/>
-        </w:rPr>
-      </w:pPr>
-      <w:hyperlink w:anchor="_Toc239761728" w:history="1">
-        <w:r>
-          <w:rPr>
-            <w:rStyle w:val="Hypertextovodkaz"/>
-            <w:noProof/>
-          </w:rPr>
-          <w:t>3</w:t>
-        </w:r>
-        <w:r>
-          <w:rPr>
-            <w:rFonts w:asciiTheme="minorHAnsi" w:eastAsiaTheme="minorEastAsia" w:hAnsiTheme="minorHAnsi" w:cstheme="minorBidi"/>
-            <w:noProof/>
-            <w:kern w:val="2"/>
-            <w:szCs w:val="24"/>
-            <w:lang w:eastAsia="cs-CZ"/>
-            <w14:ligatures w14:val="standardContextual"/>
-          </w:rPr>
-          <w:tab/>
-        </w:r>
-        <w:r>
-          <w:rPr>
-            <w:rStyle w:val="Hypertextovodkaz"/>
-            <w:noProof/>
-          </w:rPr>
-          <w:t>Nadpis 1</w:t>
-        </w:r>
-        <w:r>
-          <w:rPr>
-            <w:noProof/>
-            <w:webHidden/>
-          </w:rPr>
-          <w:tab/>
-        </w:r>
-        <w:r>
-          <w:rPr>
-            <w:noProof/>
-            <w:webHidden/>
-          </w:rPr>
-          <w:fldChar w:fldCharType="begin"/>
-        </w:r>
-        <w:r>
-          <w:rPr>
-            <w:noProof/>
-            <w:webHidden/>
-          </w:rPr>
-          <w:instrText xml:space="preserve"> PAGEREF _Toc239761728 \h </w:instrText>
-        </w:r>
-        <w:r>
-          <w:rPr>
-            <w:noProof/>
-            <w:webHidden/>
-          </w:rPr>
-        </w:r>
-        <w:r>
-          <w:rPr>
-            <w:noProof/>
-            <w:webHidden/>
-          </w:rPr>
-          <w:fldChar w:fldCharType="separate"/>
-        </w:r>
-        <w:r>
-          <w:rPr>
-            <w:noProof/>
-            <w:webHidden/>
-          </w:rPr>
-          <w:t>5</w:t>
-        </w:r>
-        <w:r>
-          <w:rPr>
-            <w:noProof/>
-            <w:webHidden/>
-          </w:rPr>
-          <w:fldChar w:fldCharType="end"/>
-        </w:r>
-      </w:hyperlink>
-    </w:p>
-    <w:p>
-      <w:pPr>
-        <w:pStyle w:val="Obsah2"/>
-        <w:tabs>
-          <w:tab w:val="left" w:pos="960"/>
-          <w:tab w:val="right" w:leader="dot" w:pos="8493"/>
-        </w:tabs>
-        <w:rPr>
-          <w:rFonts w:asciiTheme="minorHAnsi" w:eastAsiaTheme="minorEastAsia" w:hAnsiTheme="minorHAnsi" w:cstheme="minorBidi"/>
-          <w:noProof/>
-          <w:kern w:val="2"/>
-          <w:szCs w:val="24"/>
-          <w:lang w:eastAsia="cs-CZ"/>
-          <w14:ligatures w14:val="standardContextual"/>
-        </w:rPr>
-      </w:pPr>
-      <w:hyperlink w:anchor="_Toc239761729" w:history="1">
-        <w:r>
-          <w:rPr>
-            <w:rStyle w:val="Hypertextovodkaz"/>
-            <w:noProof/>
-          </w:rPr>
-          <w:t>3.1</w:t>
-        </w:r>
-        <w:r>
-          <w:rPr>
-            <w:rFonts w:asciiTheme="minorHAnsi" w:eastAsiaTheme="minorEastAsia" w:hAnsiTheme="minorHAnsi" w:cstheme="minorBidi"/>
-            <w:noProof/>
-            <w:kern w:val="2"/>
-            <w:szCs w:val="24"/>
-            <w:lang w:eastAsia="cs-CZ"/>
-            <w14:ligatures w14:val="standardContextual"/>
-          </w:rPr>
-          <w:tab/>
-        </w:r>
-        <w:r>
-          <w:rPr>
-            <w:rStyle w:val="Hypertextovodkaz"/>
-            <w:noProof/>
-          </w:rPr>
-          <w:t>Nadpis 2</w:t>
-        </w:r>
-        <w:r>
-          <w:rPr>
-            <w:noProof/>
-            <w:webHidden/>
-          </w:rPr>
-          <w:tab/>
-        </w:r>
-        <w:r>
-          <w:rPr>
-            <w:noProof/>
-            <w:webHidden/>
-          </w:rPr>
-          <w:fldChar w:fldCharType="begin"/>
-        </w:r>
-        <w:r>
-          <w:rPr>
-            <w:noProof/>
-            <w:webHidden/>
-          </w:rPr>
-          <w:instrText xml:space="preserve"> PAGEREF _Toc239761729 \h </w:instrText>
-        </w:r>
-        <w:r>
-          <w:rPr>
-            <w:noProof/>
-            <w:webHidden/>
-          </w:rPr>
-        </w:r>
-        <w:r>
-          <w:rPr>
-            <w:noProof/>
-            <w:webHidden/>
-          </w:rPr>
-          <w:fldChar w:fldCharType="separate"/>
-        </w:r>
-        <w:r>
-          <w:rPr>
-            <w:noProof/>
-            <w:webHidden/>
-          </w:rPr>
-          <w:t>5</w:t>
-        </w:r>
-        <w:r>
-          <w:rPr>
-            <w:noProof/>
-            <w:webHidden/>
-          </w:rPr>
-          <w:fldChar w:fldCharType="end"/>
-        </w:r>
-      </w:hyperlink>
-    </w:p>
-    <w:p>
-      <w:pPr>
-        <w:pStyle w:val="Obsah3"/>
-        <w:tabs>
-          <w:tab w:val="left" w:pos="1440"/>
-          <w:tab w:val="right" w:leader="dot" w:pos="8493"/>
-        </w:tabs>
-        <w:rPr>
-          <w:rFonts w:asciiTheme="minorHAnsi" w:eastAsiaTheme="minorEastAsia" w:hAnsiTheme="minorHAnsi" w:cstheme="minorBidi"/>
-          <w:noProof/>
-          <w:kern w:val="2"/>
-          <w:szCs w:val="24"/>
-          <w:lang w:eastAsia="cs-CZ"/>
-          <w14:ligatures w14:val="standardContextual"/>
-        </w:rPr>
-      </w:pPr>
-      <w:hyperlink w:anchor="_Toc239761730" w:history="1">
-        <w:r>
-          <w:rPr>
-            <w:rStyle w:val="Hypertextovodkaz"/>
-            <w:noProof/>
-          </w:rPr>
-          <w:t>3.1.1</w:t>
-        </w:r>
-        <w:r>
-          <w:rPr>
-            <w:rFonts w:asciiTheme="minorHAnsi" w:eastAsiaTheme="minorEastAsia" w:hAnsiTheme="minorHAnsi" w:cstheme="minorBidi"/>
-            <w:noProof/>
-            <w:kern w:val="2"/>
-            <w:szCs w:val="24"/>
-            <w:lang w:eastAsia="cs-CZ"/>
-            <w14:ligatures w14:val="standardContextual"/>
-          </w:rPr>
-          <w:tab/>
-        </w:r>
-        <w:r>
-          <w:rPr>
-            <w:rStyle w:val="Hypertextovodkaz"/>
-            <w:noProof/>
-          </w:rPr>
-          <w:t>Nadpis 3</w:t>
-        </w:r>
-        <w:r>
-          <w:rPr>
-            <w:noProof/>
-            <w:webHidden/>
-          </w:rPr>
-          <w:tab/>
-        </w:r>
-        <w:r>
-          <w:rPr>
-            <w:noProof/>
-            <w:webHidden/>
-          </w:rPr>
-          <w:fldChar w:fldCharType="begin"/>
-        </w:r>
-        <w:r>
-          <w:rPr>
-            <w:noProof/>
-            <w:webHidden/>
-          </w:rPr>
-          <w:instrText xml:space="preserve"> PAGEREF _Toc239761730 \h </w:instrText>
-        </w:r>
-        <w:r>
-          <w:rPr>
-            <w:noProof/>
-            <w:webHidden/>
-          </w:rPr>
-        </w:r>
-        <w:r>
-          <w:rPr>
-            <w:noProof/>
-            <w:webHidden/>
-          </w:rPr>
-          <w:fldChar w:fldCharType="separate"/>
-        </w:r>
-        <w:r>
-          <w:rPr>
-            <w:noProof/>
-            <w:webHidden/>
-          </w:rPr>
-          <w:t>5</w:t>
-        </w:r>
-        <w:r>
-          <w:rPr>
-            <w:noProof/>
-            <w:webHidden/>
-          </w:rPr>
-          <w:fldChar w:fldCharType="end"/>
-        </w:r>
-      </w:hyperlink>
-    </w:p>
-    <w:p>
-      <w:pPr>
-        <w:pStyle w:val="Obsah1"/>
-        <w:tabs>
-          <w:tab w:val="left" w:pos="480"/>
-          <w:tab w:val="right" w:leader="dot" w:pos="8493"/>
-        </w:tabs>
-        <w:rPr>
-          <w:rFonts w:asciiTheme="minorHAnsi" w:eastAsiaTheme="minorEastAsia" w:hAnsiTheme="minorHAnsi" w:cstheme="minorBidi"/>
-          <w:noProof/>
-          <w:kern w:val="2"/>
-          <w:szCs w:val="24"/>
-          <w:lang w:eastAsia="cs-CZ"/>
-          <w14:ligatures w14:val="standardContextual"/>
-        </w:rPr>
-      </w:pPr>
-      <w:hyperlink w:anchor="_Toc239761731" w:history="1">
-        <w:r>
-          <w:rPr>
-            <w:rStyle w:val="Hypertextovodkaz"/>
-            <w:noProof/>
-          </w:rPr>
-          <w:t>4</w:t>
-        </w:r>
-        <w:r>
-          <w:rPr>
-            <w:rFonts w:asciiTheme="minorHAnsi" w:eastAsiaTheme="minorEastAsia" w:hAnsiTheme="minorHAnsi" w:cstheme="minorBidi"/>
-            <w:noProof/>
-            <w:kern w:val="2"/>
-            <w:szCs w:val="24"/>
-            <w:lang w:eastAsia="cs-CZ"/>
-            <w14:ligatures w14:val="standardContextual"/>
-          </w:rPr>
-          <w:tab/>
-        </w:r>
-        <w:r>
-          <w:rPr>
-            <w:rStyle w:val="Hypertextovodkaz"/>
-            <w:noProof/>
-          </w:rPr>
-          <w:t>Závěr</w:t>
-        </w:r>
-        <w:r>
-          <w:rPr>
-            <w:noProof/>
-            <w:webHidden/>
-          </w:rPr>
-          <w:tab/>
-        </w:r>
-        <w:r>
-          <w:rPr>
-            <w:noProof/>
-            <w:webHidden/>
-          </w:rPr>
-          <w:fldChar w:fldCharType="begin"/>
-        </w:r>
-        <w:r>
-          <w:rPr>
-            <w:noProof/>
-            <w:webHidden/>
-          </w:rPr>
-          <w:instrText xml:space="preserve"> PAGEREF _Toc239761731 \h </w:instrText>
-        </w:r>
-        <w:r>
-          <w:rPr>
-            <w:noProof/>
-            <w:webHidden/>
-          </w:rPr>
-        </w:r>
-        <w:r>
-          <w:rPr>
-            <w:noProof/>
-            <w:webHidden/>
-          </w:rPr>
-          <w:fldChar w:fldCharType="separate"/>
-        </w:r>
-        <w:r>
-          <w:rPr>
-            <w:noProof/>
-            <w:webHidden/>
-          </w:rPr>
-          <w:t>6</w:t>
-        </w:r>
-        <w:r>
-          <w:rPr>
-            <w:noProof/>
-            <w:webHidden/>
-          </w:rPr>
-          <w:fldChar w:fldCharType="end"/>
-        </w:r>
-      </w:hyperlink>
-    </w:p>
-    <w:p>
-      <w:pPr>
-        <w:pStyle w:val="Obsah1"/>
-        <w:tabs>
-          <w:tab w:val="right" w:leader="dot" w:pos="8493"/>
-        </w:tabs>
-        <w:rPr>
-          <w:rFonts w:asciiTheme="minorHAnsi" w:eastAsiaTheme="minorEastAsia" w:hAnsiTheme="minorHAnsi" w:cstheme="minorBidi"/>
-          <w:noProof/>
-          <w:kern w:val="2"/>
-          <w:szCs w:val="24"/>
-          <w:lang w:eastAsia="cs-CZ"/>
-          <w14:ligatures w14:val="standardContextual"/>
-        </w:rPr>
-      </w:pPr>
-      <w:hyperlink w:anchor="_Toc239761732" w:history="1">
-        <w:r>
-          <w:rPr>
-            <w:rStyle w:val="Hypertextovodkaz"/>
-            <w:noProof/>
-          </w:rPr>
-          <w:t>Seznam použité literatury</w:t>
-        </w:r>
-        <w:r>
-          <w:rPr>
-            <w:noProof/>
-            <w:webHidden/>
-          </w:rPr>
-          <w:tab/>
-        </w:r>
-        <w:r>
-          <w:rPr>
-            <w:noProof/>
-            <w:webHidden/>
-          </w:rPr>
-          <w:fldChar w:fldCharType="begin"/>
-        </w:r>
-        <w:r>
-          <w:rPr>
-            <w:noProof/>
-            <w:webHidden/>
-          </w:rPr>
-          <w:instrText xml:space="preserve"> PAGEREF _Toc239761732 \h </w:instrText>
-        </w:r>
-        <w:r>
-          <w:rPr>
-            <w:noProof/>
-            <w:webHidden/>
-          </w:rPr>
-        </w:r>
-        <w:r>
-          <w:rPr>
-            <w:noProof/>
-            <w:webHidden/>
-          </w:rPr>
-          <w:fldChar w:fldCharType="separate"/>
-        </w:r>
-        <w:r>
-          <w:rPr>
-            <w:noProof/>
-            <w:webHidden/>
-          </w:rPr>
-          <w:t>7</w:t>
-        </w:r>
-        <w:r>
-          <w:rPr>
-            <w:noProof/>
-            <w:webHidden/>
-          </w:rPr>
-          <w:fldChar w:fldCharType="end"/>
-        </w:r>
-      </w:hyperlink>
-    </w:p>
-    <w:p>
-      <w:pPr>
-        <w:pStyle w:val="Obsah1"/>
-        <w:tabs>
-          <w:tab w:val="right" w:leader="dot" w:pos="8493"/>
-        </w:tabs>
-        <w:rPr>
-          <w:rFonts w:asciiTheme="minorHAnsi" w:eastAsiaTheme="minorEastAsia" w:hAnsiTheme="minorHAnsi" w:cstheme="minorBidi"/>
-          <w:noProof/>
-          <w:kern w:val="2"/>
-          <w:szCs w:val="24"/>
-          <w:lang w:eastAsia="cs-CZ"/>
-          <w14:ligatures w14:val="standardContextual"/>
-        </w:rPr>
-      </w:pPr>
-      <w:hyperlink w:anchor="_Toc239761733" w:history="1">
-        <w:r>
-          <w:rPr>
-            <w:rStyle w:val="Hypertextovodkaz"/>
-            <w:noProof/>
-          </w:rPr>
-          <w:t>Seznam zkratek</w:t>
-        </w:r>
-        <w:r>
-          <w:rPr>
-            <w:noProof/>
-            <w:webHidden/>
-          </w:rPr>
-          <w:tab/>
-        </w:r>
-        <w:r>
-          <w:rPr>
-            <w:noProof/>
-            <w:webHidden/>
-          </w:rPr>
-          <w:fldChar w:fldCharType="begin"/>
-        </w:r>
-        <w:r>
-          <w:rPr>
-            <w:noProof/>
-            <w:webHidden/>
-          </w:rPr>
-          <w:instrText xml:space="preserve"> PAGEREF _Toc239761733 \h </w:instrText>
-        </w:r>
-        <w:r>
-          <w:rPr>
-            <w:noProof/>
-            <w:webHidden/>
-          </w:rPr>
-        </w:r>
-        <w:r>
-          <w:rPr>
-            <w:noProof/>
-            <w:webHidden/>
-          </w:rPr>
-          <w:fldChar w:fldCharType="separate"/>
-        </w:r>
-        <w:r>
-          <w:rPr>
-            <w:noProof/>
-            <w:webHidden/>
-          </w:rPr>
-          <w:t>9</w:t>
-        </w:r>
-        <w:r>
-          <w:rPr>
-            <w:noProof/>
-            <w:webHidden/>
-          </w:rPr>
-          <w:fldChar w:fldCharType="end"/>
-        </w:r>
-      </w:hyperlink>
-    </w:p>
-    <w:p>
-      <w:pPr>
-        <w:spacing w:after="100"/>
-        <w:rPr>
-          <w:szCs w:val="24"/>
-        </w:rPr>
-      </w:pPr>
-      <w:r>
-        <w:fldChar w:fldCharType="end"/>
-      </w:r>
-      <w:r>
-        <w:rPr>
-          <w:szCs w:val="24"/>
-        </w:rPr>
-        <w:t>Seznam příloh</w:t>
-      </w:r>
-    </w:p>
-    <w:p>
-      <w:pPr>
-        <w:spacing w:after="100"/>
-      </w:pPr>
-      <w:r>
-        <w:rPr>
-          <w:szCs w:val="24"/>
-        </w:rPr>
-        <w:t>Přílohy</w:t>
+      </w:pPr>
+      <w:r>
+        <w:t xml:space="preserve">Přílohy</w:t>
       </w:r>
     </w:p>
     <w:p>

</xml_diff>

<commit_message>
docs(bp): zoznam literatúry prevedený do citačného štýlu APA
Smernica v čl. IV predpisuje APA, pôvodný zoznam bol v STN ISO 690. Položky sú
preformátované, zoradené abecedne a vysadené s predsadením prvého riadku.

Nič sa nedopĺňalo nad rámec pôvodných údajov. Poznámka na konci zoznamu uvádza,
čo treba pred odovzdaním overiť — mená autorov skryté za „et al.“, chybne
uvedeného autora dokumentácie CustomTkinter, chýbajúce DOI a zdroje, na ktoré
po prepracovaní ekonomickej kapitoly už nebude v texte odkaz.

Co-Authored-By: Claude Opus 5 <noreply@anthropic.com>
</commit_message>
<xml_diff>
--- a/docs/Bakalarska_praca_Serafin.docx
+++ b/docs/Bakalarska_praca_Serafin.docx
@@ -19811,6 +19811,234 @@
     </w:p>
     <w:p>
       <w:pPr>
+        <w:pStyle w:val="Odstavecseseznamem"/>
+        <w:ind w:left="454" w:hanging="454"/>
+        <w:spacing w:before="0" w:after="120" w:line="240" w:lineRule="auto"/>
+        <w:contextualSpacing w:val="0"/>
+        <w:jc w:val="left"/>
+      </w:pPr>
+      <w:r>
+        <w:t xml:space="preserve">Cormen, T. H., Leiserson, C. E., Rivest, R. L., &amp; Stein, C. (2022). Introduction to Algorithms (4. vyd.). MIT Press.</w:t>
+      </w:r>
+    </w:p>
+    <w:p>
+      <w:pPr>
+        <w:pStyle w:val="Odstavecseseznamem"/>
+        <w:ind w:left="454" w:hanging="454"/>
+        <w:spacing w:before="0" w:after="120" w:line="240" w:lineRule="auto"/>
+        <w:contextualSpacing w:val="0"/>
+        <w:jc w:val="left"/>
+      </w:pPr>
+      <w:r>
+        <w:t xml:space="preserve">Demeulemeester, E., &amp; Herroelen, W. (2002). Project Scheduling: A Research Handbook. Kluwer Academic Publishers.</w:t>
+      </w:r>
+    </w:p>
+    <w:p>
+      <w:pPr>
+        <w:pStyle w:val="Odstavecseseznamem"/>
+        <w:ind w:left="454" w:hanging="454"/>
+        <w:spacing w:before="0" w:after="120" w:line="240" w:lineRule="auto"/>
+        <w:contextualSpacing w:val="0"/>
+        <w:jc w:val="left"/>
+      </w:pPr>
+      <w:r>
+        <w:t xml:space="preserve">Eurostat. (2024). Digital Economy and Society Statistics — Enterprises. Dostupné 15. 4. 2025 z https://ec.europa.eu/eurostat/statistics-explained/index.php?title=Digital_economy_and_society_statistics_-_enterprises</w:t>
+      </w:r>
+    </w:p>
+    <w:p>
+      <w:pPr>
+        <w:pStyle w:val="Odstavecseseznamem"/>
+        <w:ind w:left="454" w:hanging="454"/>
+        <w:spacing w:before="0" w:after="120" w:line="240" w:lineRule="auto"/>
+        <w:contextualSpacing w:val="0"/>
+        <w:jc w:val="left"/>
+      </w:pPr>
+      <w:r>
+        <w:t xml:space="preserve">Fowler, M. (2002). Patterns of Enterprise Application Architecture. Addison-Wesley.</w:t>
+      </w:r>
+    </w:p>
+    <w:p>
+      <w:pPr>
+        <w:pStyle w:val="Odstavecseseznamem"/>
+        <w:ind w:left="454" w:hanging="454"/>
+        <w:spacing w:before="0" w:after="120" w:line="240" w:lineRule="auto"/>
+        <w:contextualSpacing w:val="0"/>
+        <w:jc w:val="left"/>
+      </w:pPr>
+      <w:r>
+        <w:t xml:space="preserve">Gantt, H. L. (1910). Work, Wages and Profits. Engineering Magazine Co.</w:t>
+      </w:r>
+    </w:p>
+    <w:p>
+      <w:pPr>
+        <w:pStyle w:val="Odstavecseseznamem"/>
+        <w:ind w:left="454" w:hanging="454"/>
+        <w:spacing w:before="0" w:after="120" w:line="240" w:lineRule="auto"/>
+        <w:contextualSpacing w:val="0"/>
+        <w:jc w:val="left"/>
+      </w:pPr>
+      <w:r>
+        <w:t xml:space="preserve">Grand View Research. (2024). Project Management Software Market Size, Share &amp; Trends Analysis Report 2024–2030. Dostupné 15. 4. 2025 z https://www.grandviewresearch.com/industry-analysis/project-management-software-market</w:t>
+      </w:r>
+    </w:p>
+    <w:p>
+      <w:pPr>
+        <w:pStyle w:val="Odstavecseseznamem"/>
+        <w:ind w:left="454" w:hanging="454"/>
+        <w:spacing w:before="0" w:after="120" w:line="240" w:lineRule="auto"/>
+        <w:contextualSpacing w:val="0"/>
+        <w:jc w:val="left"/>
+      </w:pPr>
+      <w:r>
+        <w:t xml:space="preserve">Hunter, J. D. (2007). Matplotlib: A 2D Graphics Environment. Computing in Science &amp; Engineering, 9(3), 90–95.</w:t>
+      </w:r>
+    </w:p>
+    <w:p>
+      <w:pPr>
+        <w:pStyle w:val="Odstavecseseznamem"/>
+        <w:ind w:left="454" w:hanging="454"/>
+        <w:spacing w:before="0" w:after="120" w:line="240" w:lineRule="auto"/>
+        <w:contextualSpacing w:val="0"/>
+        <w:jc w:val="left"/>
+      </w:pPr>
+      <w:r>
+        <w:t xml:space="preserve">Kahn, A. B. (1962). Topological Sorting of Large Networks. Communications of the ACM, 5(11), 558–562.</w:t>
+      </w:r>
+    </w:p>
+    <w:p>
+      <w:pPr>
+        <w:pStyle w:val="Odstavecseseznamem"/>
+        <w:ind w:left="454" w:hanging="454"/>
+        <w:spacing w:before="0" w:after="120" w:line="240" w:lineRule="auto"/>
+        <w:contextualSpacing w:val="0"/>
+        <w:jc w:val="left"/>
+      </w:pPr>
+      <w:r>
+        <w:t xml:space="preserve">Kelley, J. E., &amp; Walker, M. R. (1959). Critical-Path Planning and Scheduling. In Proceedings of the Eastern Joint Computer Conference (s. 160–173).</w:t>
+      </w:r>
+    </w:p>
+    <w:p>
+      <w:pPr>
+        <w:pStyle w:val="Odstavecseseznamem"/>
+        <w:ind w:left="454" w:hanging="454"/>
+        <w:spacing w:before="0" w:after="120" w:line="240" w:lineRule="auto"/>
+        <w:contextualSpacing w:val="0"/>
+        <w:jc w:val="left"/>
+      </w:pPr>
+      <w:r>
+        <w:t xml:space="preserve">Malcolm, D. G., Roseboom, J. H., Clark, C. E., &amp; Fazar, W. (1959). Application of a Technique for Research and Development Program Evaluation. Operations Research, 7(5), 646–669.</w:t>
+      </w:r>
+    </w:p>
+    <w:p>
+      <w:pPr>
+        <w:pStyle w:val="Odstavecseseznamem"/>
+        <w:ind w:left="454" w:hanging="454"/>
+        <w:spacing w:before="0" w:after="120" w:line="240" w:lineRule="auto"/>
+        <w:contextualSpacing w:val="0"/>
+        <w:jc w:val="left"/>
+      </w:pPr>
+      <w:r>
+        <w:t xml:space="preserve">McKinsey &amp; Company. (2012). Delivering Large-Scale IT Projects on Time, on Budget, and on Value. Dostupné 15. 4. 2025 z https://www.mckinsey.com/capabilities/mckinsey-digital/our-insights/delivering-large-scale-it-projects-on-time-on-budget-and-on-value</w:t>
+      </w:r>
+    </w:p>
+    <w:p>
+      <w:pPr>
+        <w:pStyle w:val="Odstavecseseznamem"/>
+        <w:ind w:left="454" w:hanging="454"/>
+        <w:spacing w:before="0" w:after="120" w:line="240" w:lineRule="auto"/>
+        <w:contextualSpacing w:val="0"/>
+        <w:jc w:val="left"/>
+      </w:pPr>
+      <w:r>
+        <w:t xml:space="preserve">Meredith, J. R., &amp; Mantel, S. J. (2015). Project Management: A Managerial Approach (9. vyd.). Wiley.</w:t>
+      </w:r>
+    </w:p>
+    <w:p>
+      <w:pPr>
+        <w:pStyle w:val="Odstavecseseznamem"/>
+        <w:ind w:left="454" w:hanging="454"/>
+        <w:spacing w:before="0" w:after="120" w:line="240" w:lineRule="auto"/>
+        <w:contextualSpacing w:val="0"/>
+        <w:jc w:val="left"/>
+      </w:pPr>
+      <w:r>
+        <w:t xml:space="preserve">OpenView Venture Partners. (2024). 2024 SaaS Benchmarks Report: Pricing, Growth &amp; GTM Metrics. Dostupné 15. 4. 2025 z https://openviewpartners.com/saas-benchmarks-report/</w:t>
+      </w:r>
+    </w:p>
+    <w:p>
+      <w:pPr>
+        <w:pStyle w:val="Odstavecseseznamem"/>
+        <w:ind w:left="454" w:hanging="454"/>
+        <w:spacing w:before="0" w:after="120" w:line="240" w:lineRule="auto"/>
+        <w:contextualSpacing w:val="0"/>
+        <w:jc w:val="left"/>
+      </w:pPr>
+      <w:r>
+        <w:t xml:space="preserve">Project Management Institute. (2021). A Guide to the Project Management Body of Knowledge (PMBOK Guide) (7. vyd.). Project Management Institute.</w:t>
+      </w:r>
+    </w:p>
+    <w:p>
+      <w:pPr>
+        <w:pStyle w:val="Odstavecseseznamem"/>
+        <w:ind w:left="454" w:hanging="454"/>
+        <w:spacing w:before="0" w:after="120" w:line="240" w:lineRule="auto"/>
+        <w:contextualSpacing w:val="0"/>
+        <w:jc w:val="left"/>
+      </w:pPr>
+      <w:r>
+        <w:t xml:space="preserve">ReportLab Group. (2024). ReportLab PDF Library User Guide. Dostupné 10. 4. 2025 z https://docs.reportlab.com/</w:t>
+      </w:r>
+    </w:p>
+    <w:p>
+      <w:pPr>
+        <w:pStyle w:val="Odstavecseseznamem"/>
+        <w:ind w:left="454" w:hanging="454"/>
+        <w:spacing w:before="0" w:after="120" w:line="240" w:lineRule="auto"/>
+        <w:contextualSpacing w:val="0"/>
+        <w:jc w:val="left"/>
+      </w:pPr>
+      <w:r>
+        <w:t xml:space="preserve">Schimansky, T. (2023). CustomTkinter Documentation. Dostupné 10. 4. 2025 z https://customtkinter.tomschimansky.com/</w:t>
+      </w:r>
+    </w:p>
+    <w:p>
+      <w:pPr>
+        <w:pStyle w:val="Odstavecseseznamem"/>
+        <w:ind w:left="454" w:hanging="454"/>
+        <w:spacing w:before="0" w:after="120" w:line="240" w:lineRule="auto"/>
+        <w:contextualSpacing w:val="0"/>
+        <w:jc w:val="left"/>
+      </w:pPr>
+      <w:r>
+        <w:t xml:space="preserve">SQLite Consortium. (2024). SQLite Documentation. Dostupné 10. 4. 2025 z https://www.sqlite.org/docs.html</w:t>
+      </w:r>
+    </w:p>
+    <w:p>
+      <w:pPr>
+        <w:pStyle w:val="Odstavecseseznamem"/>
+        <w:ind w:left="454" w:hanging="454"/>
+        <w:spacing w:before="0" w:after="120" w:line="240" w:lineRule="auto"/>
+        <w:contextualSpacing w:val="0"/>
+        <w:jc w:val="left"/>
+      </w:pPr>
+      <w:r>
+        <w:t xml:space="preserve">Van Rossum, G., Warsaw, B., &amp; Coghlan, N. (2001). PEP 8 — Style Guide for Python Code. Dostupné 10. 4. 2025 z https://peps.python.org/pep-0008/</w:t>
+      </w:r>
+    </w:p>
+    <w:p>
+      <w:pPr>
+        <w:pStyle w:val="Odstavecseseznamem"/>
+        <w:ind w:left="454" w:hanging="454"/>
+        <w:spacing w:before="0" w:after="120" w:line="240" w:lineRule="auto"/>
+        <w:contextualSpacing w:val="0"/>
+        <w:jc w:val="left"/>
+      </w:pPr>
+      <w:r>
+        <w:t xml:space="preserve">Wellingtone. (2023). The State of Project Management 2023. Dostupné 15. 4. 2025 z https://wellingtone.co.uk/the-state-of-project-management/</w:t>
+      </w:r>
+    </w:p>
+    <w:p>
+      <w:pPr>
         <w:pStyle w:val="Zkladntext"/>
       </w:pPr>
       <w:r>
@@ -19824,7 +20052,7 @@
         <w:rPr>
           <w:highlight w:val="yellow"/>
         </w:rPr>
-        <w:t xml:space="preserve">Zoznam literatúry zostaviť nanovo podľa citačnej normy APA, abecedne. Podľa čl. IV smernice sú potrebné recenzované zdroje s ISBN/ISSN vrátane zahraničnej literatúry; komerčné weby a trhové reporty môžu byť len doplnkové. Pri každom prevzatom tvrdení a čísle overiť, že zdroj ho naozaj obsahuje.</w:t>
+        <w:t xml:space="preserve">Zoznam je prevedený z normy STN ISO 690 do citačného štýlu APA podľa vzorov v smernici EKF_SME_07_004. Pred odovzdaním treba: (1) overiť mená autorov, ktoré boli v pôvodnom zozname skryté za „et al.“ — ide o položky Cormen a kol. a Malcolm a kol.; (2) opraviť autora dokumentácie CustomTkinter, ktorý bol v pôvodnom zozname uvedený ako „Reitz, Jasper“, hoci doména aj projekt patria T. Schimanskému; (3) doplniť DOI tam, kde existuje, najmä pri článkoch Hunter (2007), Kahn (1962) a Malcolm a kol. (1959); (4) vyradiť zdroje, na ktoré po prepracovaní ekonomickej kapitoly už nebude v texte odkaz — týka sa to trhových reportov Grand View Research, Wellingtone, McKinsey a OpenView; (5) doplniť odborné zdroje k novým kapitolám — projektové riadenie, informačné systémy a softvérová architektúra, bezpečnosť, použiteľnosť, GDPR a MiFID II; (6) doplniť citáciu použitého nástroja generatívnej AI podľa čl. IV smernice.</w:t>
       </w:r>
     </w:p>
     <w:p>

</xml_diff>

<commit_message>
docs(bp): napísaná kapitola Metodika riešenia a vyhodnotenia
Prázdna metodika bola hlavný dôvod, prečo text pôsobil ako technická
dokumentácia. Doplnený je postup riešenia, metóda zberu požiadaviek a kritériá
porovnania nástrojov, štyri úrovne overenia vrátane návrhu používateľského
testovania so škálou SUS, a metodika ekonomického posúdenia.

Kapitola o použití generatívnej AI popisuje rozdelenie práce a spôsob kontroly
výstupov; ako doklad uvádza chybu v migrácii hesiel, ktorú odhalilo až overenie
správania po reštarte, nie generovanie kódu ani existujúce testy.

Miesta závislé od údajov, ktoré pozná len autor — priebeh konzultácie, výsledky
používateľského testovania a vstupné hodnoty ekonomického modelu — zostávajú
označené značkou.

Co-Authored-By: Claude Opus 5 <noreply@anthropic.com>
</commit_message>
<xml_diff>
--- a/docs/Bakalarska_praca_Serafin.docx
+++ b/docs/Bakalarska_praca_Serafin.docx
@@ -2454,6 +2454,494 @@
     </w:p>
     <w:p>
       <w:pPr>
+        <w:pStyle w:val="Nadpis2"/>
+      </w:pPr>
+      <w:r>
+        <w:t xml:space="preserve">Postup riešenia a návrh systému</w:t>
+      </w:r>
+    </w:p>
+    <w:p>
+      <w:pPr>
+        <w:pStyle w:val="Zkladntext"/>
+      </w:pPr>
+      <w:r>
+        <w:t xml:space="preserve">Riešenie vzniklo iteratívne. Namiesto jednorazového návrhu celého systému sa postupovalo v etapách, pričom každá etapa priniesla funkčný celok, ktorý bolo možné overiť skôr, než sa pokračovalo ďalej. Tento postup bol zvolený preto, že požiadavky neboli na začiatku úplne známe a spresňovali sa až pri práci so skutočnými projektovými dátami.</w:t>
+      </w:r>
+    </w:p>
+    <w:p>
+      <w:pPr>
+        <w:pStyle w:val="Zkladntext"/>
+      </w:pPr>
+      <w:r>
+        <w:t xml:space="preserve">Prvou etapou bol desktopový prototyp. Jeho účelom bolo overiť, či je výpočet kritickej cesty použiteľný pre plánovanie v malej organizácii a aké údaje o úlohách sú preň nevyhnutné. Prototyp nebol určený na nasadenie; slúžil na overenie dátového modelu a algoritmu v podmienkach bez sieťovej vrstvy a bez viacerých súčasne pracujúcich používateľov.</w:t>
+      </w:r>
+    </w:p>
+    <w:p>
+      <w:pPr>
+        <w:pStyle w:val="Zkladntext"/>
+      </w:pPr>
+      <w:r>
+        <w:t xml:space="preserve">Druhou etapou bol prechod na webový informačný systém. Dôvodom bola potreba súčasnej práce viacerých členov tímu nad jedným plánom, ktorú desktopové riešenie s lokálnym súborom databázy neumožňovalo.</w:t>
+      </w:r>
+    </w:p>
+    <w:p>
+      <w:pPr>
+        <w:pStyle w:val="Zkladntext"/>
+      </w:pPr>
+      <w:r>
+        <w:t xml:space="preserve">Návrh architektúry vychádzal zo zásady oddelenia zodpovedností do vrstiev. Prístup k dátam je sústredený do repozitárov, výpočtová logika je od nich nezávislá a prezentačná vrstva k dátam pristupuje výhradne cez aplikačné rozhranie. Toto usporiadanie umožnilo testovať výpočet kritickej cesty oddelene od databázy aj od používateľského rozhrania.</w:t>
+      </w:r>
+    </w:p>
+    <w:p>
+      <w:pPr>
+        <w:pStyle w:val="Zkladntext"/>
+      </w:pPr>
+      <w:r>
+        <w:t xml:space="preserve">Dátový model bol navrhnutý postupne — od entít nevyhnutných pre výpočet kritickej cesty (úloha, trvanie, závislosť) k entitám podporujúcim tímovú prácu a oddelenie organizácií. Každé rozšírenie bolo premietnuté do schémy tak, aby existujúce dáta zostali použiteľné.</w:t>
+      </w:r>
+    </w:p>
+    <w:p>
+      <w:pPr>
+        <w:pStyle w:val="Zkladntext"/>
+      </w:pPr>
+      <w:r>
+        <w:t xml:space="preserve">Celý vývoj je zaznamenaný v systéme správy verzií. História zmien umožňuje spätne doložiť, kedy a z akého dôvodu bola ktorá časť riešenia vytvorená alebo upravená.</w:t>
+      </w:r>
+    </w:p>
+    <w:p>
+      <w:pPr>
+        <w:pStyle w:val="Nadpis2"/>
+      </w:pPr>
+      <w:r>
+        <w:t xml:space="preserve">Metóda zberu požiadaviek a porovnania nástrojov</w:t>
+      </w:r>
+    </w:p>
+    <w:p>
+      <w:pPr>
+        <w:pStyle w:val="Zkladntext"/>
+      </w:pPr>
+      <w:r>
+        <w:t xml:space="preserve">Požiadavky na systém boli získané dvoma spôsobmi: konzultáciou s odborníkom z praxe a porovnaním existujúcich nástrojov.</w:t>
+      </w:r>
+    </w:p>
+    <w:p>
+      <w:pPr>
+        <w:pStyle w:val="Zkladntext"/>
+      </w:pPr>
+      <w:r>
+        <w:t xml:space="preserve">Konzultácia prebehla formou neštruktúrovaného rozhovoru so skúseným pracovníkom z oblasti finančného poradenstva, ktorý v praxi riadi projektovú agendu. Cieľom nebolo získať reprezentatívny obraz trhu, ale porozumieť tomu, ako plánovanie prebieha v skutočnosti a kde naráža na obmedzenia. Zistenia z rozhovoru boli následne prevedené na funkčné požiadavky.</w:t>
+      </w:r>
+    </w:p>
+    <w:p>
+      <w:pPr>
+        <w:pStyle w:val="Zkladntext"/>
+      </w:pPr>
+      <w:r>
+        <w:t xml:space="preserve">Toto obmedzenie je nutné otvorene priznať: ide o jedného respondenta z jednej domény. Získané požiadavky preto nemožno zovšeobecňovať na celý trh a predstavujú vstup pre návrh, nie výsledok prieskumu. Organizácia nie je v práci identifikovaná.</w:t>
+      </w:r>
+    </w:p>
+    <w:p>
+      <w:pPr>
+        <w:pStyle w:val="Zkladntext"/>
+      </w:pPr>
+      <w:r>
+        <w:t xml:space="preserve">Druhým zdrojom bolo porovnanie existujúcich nástrojov. Nástroje boli vybrané tak, aby pokryli rôzne prístupy k problému — komerčné cloudové služby, riešenie s otvoreným zdrojovým kódom aj bezplatnú desktopovú alternatívu. Porovnávané boli podľa vopred stanovených kritérií uvedených v nasledujúcej tabuľke.</w:t>
+      </w:r>
+    </w:p>
+    <w:p>
+      <w:pPr>
+        <w:pStyle w:val="Titulek"/>
+      </w:pPr>
+      <w:r>
+        <w:t xml:space="preserve">Tab. 3.1 [doplniť popis tabuľky]</w:t>
+      </w:r>
+    </w:p>
+    <w:tbl>
+      <w:tblPr>
+        <w:tblW w:w="9069" w:type="dxa"/>
+        <w:tblLayout w:type="fixed"/>
+        <w:tblBorders>
+          <w:top w:val="single" w:sz="4" w:space="0" w:color="auto"/>
+          <w:left w:val="single" w:sz="4" w:space="0" w:color="auto"/>
+          <w:bottom w:val="single" w:sz="4" w:space="0" w:color="auto"/>
+          <w:right w:val="single" w:sz="4" w:space="0" w:color="auto"/>
+          <w:insideH w:val="single" w:sz="4" w:space="0" w:color="auto"/>
+          <w:insideV w:val="single" w:sz="4" w:space="0" w:color="auto"/>
+        </w:tblBorders>
+        <w:tblLook w:val="04A0" w:firstRow="1" w:lastRow="0" w:firstColumn="1" w:lastColumn="0" w:noHBand="0" w:noVBand="1"/>
+      </w:tblPr>
+      <w:tblGrid>
+        <w:gridCol w:w="3642"/>
+        <w:gridCol w:w="5427"/>
+      </w:tblGrid>
+      <w:tr>
+        <w:trPr>
+          <w:tblHeader/>
+        </w:trPr>
+        <w:tc>
+          <w:tcPr>
+            <w:tcW w:w="3642" w:type="dxa"/>
+          </w:tcPr>
+          <w:p>
+            <w:pPr>
+              <w:pStyle w:val="Zkladntext"/>
+              <w:ind w:firstLine="0" w:left="0" w:right="0"/>
+              <w:spacing w:before="20" w:after="20" w:line="240" w:lineRule="auto"/>
+              <w:jc w:val="center"/>
+            </w:pPr>
+            <w:r>
+              <w:rPr>
+                <w:b/>
+              </w:rPr>
+              <w:t xml:space="preserve">Kritérium</w:t>
+            </w:r>
+          </w:p>
+        </w:tc>
+        <w:tc>
+          <w:tcPr>
+            <w:tcW w:w="5427" w:type="dxa"/>
+          </w:tcPr>
+          <w:p>
+            <w:pPr>
+              <w:pStyle w:val="Zkladntext"/>
+              <w:ind w:firstLine="0" w:left="0" w:right="0"/>
+              <w:spacing w:before="20" w:after="20" w:line="240" w:lineRule="auto"/>
+              <w:jc w:val="center"/>
+            </w:pPr>
+            <w:r>
+              <w:rPr>
+                <w:b/>
+              </w:rPr>
+              <w:t xml:space="preserve">Dôvod zaradenia</w:t>
+            </w:r>
+          </w:p>
+        </w:tc>
+      </w:tr>
+      <w:tr>
+        <w:tc>
+          <w:tcPr>
+            <w:tcW w:w="3642" w:type="dxa"/>
+          </w:tcPr>
+          <w:p>
+            <w:pPr>
+              <w:pStyle w:val="Zkladntext"/>
+              <w:ind w:firstLine="0" w:left="0" w:right="0"/>
+              <w:spacing w:before="20" w:after="20" w:line="240" w:lineRule="auto"/>
+              <w:jc w:val="center"/>
+            </w:pPr>
+            <w:r>
+              <w:t xml:space="preserve">Cena</w:t>
+            </w:r>
+          </w:p>
+        </w:tc>
+        <w:tc>
+          <w:tcPr>
+            <w:tcW w:w="5427" w:type="dxa"/>
+          </w:tcPr>
+          <w:p>
+            <w:pPr>
+              <w:pStyle w:val="Zkladntext"/>
+              <w:ind w:firstLine="0" w:left="0" w:right="0"/>
+              <w:spacing w:before="20" w:after="20" w:line="240" w:lineRule="auto"/>
+              <w:jc w:val="left"/>
+            </w:pPr>
+            <w:r>
+              <w:t xml:space="preserve">Rozhodujúci faktor pre malé organizácie</w:t>
+            </w:r>
+          </w:p>
+        </w:tc>
+      </w:tr>
+      <w:tr>
+        <w:tc>
+          <w:tcPr>
+            <w:tcW w:w="3642" w:type="dxa"/>
+          </w:tcPr>
+          <w:p>
+            <w:pPr>
+              <w:pStyle w:val="Zkladntext"/>
+              <w:ind w:firstLine="0" w:left="0" w:right="0"/>
+              <w:spacing w:before="20" w:after="20" w:line="240" w:lineRule="auto"/>
+              <w:jc w:val="left"/>
+            </w:pPr>
+            <w:r>
+              <w:t xml:space="preserve">Výpočet kritickej cesty</w:t>
+            </w:r>
+          </w:p>
+        </w:tc>
+        <w:tc>
+          <w:tcPr>
+            <w:tcW w:w="5427" w:type="dxa"/>
+          </w:tcPr>
+          <w:p>
+            <w:pPr>
+              <w:pStyle w:val="Zkladntext"/>
+              <w:ind w:firstLine="0" w:left="0" w:right="0"/>
+              <w:spacing w:before="20" w:after="20" w:line="240" w:lineRule="auto"/>
+              <w:jc w:val="left"/>
+            </w:pPr>
+            <w:r>
+              <w:t xml:space="preserve">Jadro riešeného problému</w:t>
+            </w:r>
+          </w:p>
+        </w:tc>
+      </w:tr>
+      <w:tr>
+        <w:tc>
+          <w:tcPr>
+            <w:tcW w:w="3642" w:type="dxa"/>
+          </w:tcPr>
+          <w:p>
+            <w:pPr>
+              <w:pStyle w:val="Zkladntext"/>
+              <w:ind w:firstLine="0" w:left="0" w:right="0"/>
+              <w:spacing w:before="20" w:after="20" w:line="240" w:lineRule="auto"/>
+              <w:jc w:val="left"/>
+            </w:pPr>
+            <w:r>
+              <w:t xml:space="preserve">Sieťový diagram</w:t>
+            </w:r>
+          </w:p>
+        </w:tc>
+        <w:tc>
+          <w:tcPr>
+            <w:tcW w:w="5427" w:type="dxa"/>
+          </w:tcPr>
+          <w:p>
+            <w:pPr>
+              <w:pStyle w:val="Zkladntext"/>
+              <w:ind w:firstLine="0" w:left="0" w:right="0"/>
+              <w:spacing w:before="20" w:after="20" w:line="240" w:lineRule="auto"/>
+              <w:jc w:val="left"/>
+            </w:pPr>
+            <w:r>
+              <w:t xml:space="preserve">Zobrazenie závislostí medzi úlohami</w:t>
+            </w:r>
+          </w:p>
+        </w:tc>
+      </w:tr>
+      <w:tr>
+        <w:tc>
+          <w:tcPr>
+            <w:tcW w:w="3642" w:type="dxa"/>
+          </w:tcPr>
+          <w:p>
+            <w:pPr>
+              <w:pStyle w:val="Zkladntext"/>
+              <w:ind w:firstLine="0" w:left="0" w:right="0"/>
+              <w:spacing w:before="20" w:after="20" w:line="240" w:lineRule="auto"/>
+              <w:jc w:val="left"/>
+            </w:pPr>
+            <w:r>
+              <w:t xml:space="preserve">Ganttov diagram</w:t>
+            </w:r>
+          </w:p>
+        </w:tc>
+        <w:tc>
+          <w:tcPr>
+            <w:tcW w:w="5427" w:type="dxa"/>
+          </w:tcPr>
+          <w:p>
+            <w:pPr>
+              <w:pStyle w:val="Zkladntext"/>
+              <w:ind w:firstLine="0" w:left="0" w:right="0"/>
+              <w:spacing w:before="20" w:after="20" w:line="240" w:lineRule="auto"/>
+              <w:jc w:val="left"/>
+            </w:pPr>
+            <w:r>
+              <w:t xml:space="preserve">Najrozšírenejší spôsob zobrazenia harmonogramu</w:t>
+            </w:r>
+          </w:p>
+        </w:tc>
+      </w:tr>
+      <w:tr>
+        <w:tc>
+          <w:tcPr>
+            <w:tcW w:w="3642" w:type="dxa"/>
+          </w:tcPr>
+          <w:p>
+            <w:pPr>
+              <w:pStyle w:val="Zkladntext"/>
+              <w:ind w:firstLine="0" w:left="0" w:right="0"/>
+              <w:spacing w:before="20" w:after="20" w:line="240" w:lineRule="auto"/>
+              <w:jc w:val="left"/>
+            </w:pPr>
+            <w:r>
+              <w:t xml:space="preserve">Riadenie zdrojov</w:t>
+            </w:r>
+          </w:p>
+        </w:tc>
+        <w:tc>
+          <w:tcPr>
+            <w:tcW w:w="5427" w:type="dxa"/>
+          </w:tcPr>
+          <w:p>
+            <w:pPr>
+              <w:pStyle w:val="Zkladntext"/>
+              <w:ind w:firstLine="0" w:left="0" w:right="0"/>
+              <w:spacing w:before="20" w:after="20" w:line="240" w:lineRule="auto"/>
+              <w:jc w:val="left"/>
+            </w:pPr>
+            <w:r>
+              <w:t xml:space="preserve">Vyťaženosť členov tímu v čase</w:t>
+            </w:r>
+          </w:p>
+        </w:tc>
+      </w:tr>
+      <w:tr>
+        <w:tc>
+          <w:tcPr>
+            <w:tcW w:w="3642" w:type="dxa"/>
+          </w:tcPr>
+          <w:p>
+            <w:pPr>
+              <w:pStyle w:val="Zkladntext"/>
+              <w:ind w:firstLine="0" w:left="0" w:right="0"/>
+              <w:spacing w:before="20" w:after="20" w:line="240" w:lineRule="auto"/>
+              <w:jc w:val="left"/>
+            </w:pPr>
+            <w:r>
+              <w:t xml:space="preserve">Tímová spolupráca</w:t>
+            </w:r>
+          </w:p>
+        </w:tc>
+        <w:tc>
+          <w:tcPr>
+            <w:tcW w:w="5427" w:type="dxa"/>
+          </w:tcPr>
+          <w:p>
+            <w:pPr>
+              <w:pStyle w:val="Zkladntext"/>
+              <w:ind w:firstLine="0" w:left="0" w:right="0"/>
+              <w:spacing w:before="20" w:after="20" w:line="240" w:lineRule="auto"/>
+              <w:jc w:val="left"/>
+            </w:pPr>
+            <w:r>
+              <w:t xml:space="preserve">Súčasná práca viacerých používateľov</w:t>
+            </w:r>
+          </w:p>
+        </w:tc>
+      </w:tr>
+      <w:tr>
+        <w:tc>
+          <w:tcPr>
+            <w:tcW w:w="3642" w:type="dxa"/>
+          </w:tcPr>
+          <w:p>
+            <w:pPr>
+              <w:pStyle w:val="Zkladntext"/>
+              <w:ind w:firstLine="0" w:left="0" w:right="0"/>
+              <w:spacing w:before="20" w:after="20" w:line="240" w:lineRule="auto"/>
+              <w:jc w:val="left"/>
+            </w:pPr>
+            <w:r>
+              <w:t xml:space="preserve">Export výstupov</w:t>
+            </w:r>
+          </w:p>
+        </w:tc>
+        <w:tc>
+          <w:tcPr>
+            <w:tcW w:w="5427" w:type="dxa"/>
+          </w:tcPr>
+          <w:p>
+            <w:pPr>
+              <w:pStyle w:val="Zkladntext"/>
+              <w:ind w:firstLine="0" w:left="0" w:right="0"/>
+              <w:spacing w:before="20" w:after="20" w:line="240" w:lineRule="auto"/>
+              <w:jc w:val="left"/>
+            </w:pPr>
+            <w:r>
+              <w:t xml:space="preserve">Prenos plánu mimo systém</w:t>
+            </w:r>
+          </w:p>
+        </w:tc>
+      </w:tr>
+      <w:tr>
+        <w:tc>
+          <w:tcPr>
+            <w:tcW w:w="3642" w:type="dxa"/>
+          </w:tcPr>
+          <w:p>
+            <w:pPr>
+              <w:pStyle w:val="Zkladntext"/>
+              <w:ind w:firstLine="0" w:left="0" w:right="0"/>
+              <w:spacing w:before="20" w:after="20" w:line="240" w:lineRule="auto"/>
+              <w:jc w:val="left"/>
+            </w:pPr>
+            <w:r>
+              <w:t xml:space="preserve">Prevádzka bez pripojenia</w:t>
+            </w:r>
+          </w:p>
+        </w:tc>
+        <w:tc>
+          <w:tcPr>
+            <w:tcW w:w="5427" w:type="dxa"/>
+          </w:tcPr>
+          <w:p>
+            <w:pPr>
+              <w:pStyle w:val="Zkladntext"/>
+              <w:ind w:firstLine="0" w:left="0" w:right="0"/>
+              <w:spacing w:before="20" w:after="20" w:line="240" w:lineRule="auto"/>
+              <w:jc w:val="left"/>
+            </w:pPr>
+            <w:r>
+              <w:t xml:space="preserve">Použiteľnosť v teréne</w:t>
+            </w:r>
+          </w:p>
+        </w:tc>
+      </w:tr>
+      <w:tr>
+        <w:tc>
+          <w:tcPr>
+            <w:tcW w:w="3642" w:type="dxa"/>
+          </w:tcPr>
+          <w:p>
+            <w:pPr>
+              <w:pStyle w:val="Zkladntext"/>
+              <w:ind w:firstLine="0" w:left="0" w:right="0"/>
+              <w:spacing w:before="20" w:after="20" w:line="240" w:lineRule="auto"/>
+              <w:jc w:val="left"/>
+            </w:pPr>
+            <w:r>
+              <w:t xml:space="preserve">Náročnosť zavedenia</w:t>
+            </w:r>
+          </w:p>
+        </w:tc>
+        <w:tc>
+          <w:tcPr>
+            <w:tcW w:w="5427" w:type="dxa"/>
+          </w:tcPr>
+          <w:p>
+            <w:pPr>
+              <w:pStyle w:val="Zkladntext"/>
+              <w:ind w:firstLine="0" w:left="0" w:right="0"/>
+              <w:spacing w:before="20" w:after="20" w:line="240" w:lineRule="auto"/>
+              <w:jc w:val="left"/>
+            </w:pPr>
+            <w:r>
+              <w:t xml:space="preserve">Čas potrebný na začatie práce</w:t>
+            </w:r>
+          </w:p>
+        </w:tc>
+      </w:tr>
+    </w:tbl>
+    <w:p>
+      <w:pPr>
+        <w:pStyle w:val="Zkladntext"/>
+      </w:pPr>
+      <w:r>
+        <w:t xml:space="preserve"/>
+      </w:r>
+    </w:p>
+    <w:p>
+      <w:pPr>
+        <w:pStyle w:val="Zkladntext"/>
+      </w:pPr>
+      <w:r>
+        <w:t xml:space="preserve">Pri každom nástroji bol zaznamenaný zdroj údajov a dátum, ku ktorému údaje platili, pretože ceny aj rozsah funkcií sa v čase menia. Rovnaké kritériá boli uplatnené aj na navrhované riešenie vrátane jeho nedostatkov.</w:t>
+      </w:r>
+    </w:p>
+    <w:p>
+      <w:pPr>
         <w:pStyle w:val="Zkladntext"/>
       </w:pPr>
       <w:r>
@@ -2467,7 +2955,7 @@
         <w:rPr>
           <w:highlight w:val="yellow"/>
         </w:rPr>
-        <w:t xml:space="preserve">CELÁ KAPITOLA CHÝBA. Podľa vedúcej má stáť PRED analýzou — najprv sa vysvetlí, ako budú požiadavky získané a podľa akých kritérií sa nástroje porovnajú, až potom sa prezentujú výsledky.</w:t>
+        <w:t xml:space="preserve">Doplniť konkrétny priebeh konzultácie — rolu konzultovanej osoby, obdobie, preberané okruhy a tabuľku požiadavka → zdroj → premietnutie do systému. Toto môže napísať len autor práce.</w:t>
       </w:r>
     </w:p>
     <w:p>
@@ -2475,7 +2963,345 @@
         <w:pStyle w:val="Nadpis2"/>
       </w:pPr>
       <w:r>
-        <w:t xml:space="preserve">Postup riešenia a návrh systému</w:t>
+        <w:t xml:space="preserve">Metodika testovania a overenia</w:t>
+      </w:r>
+    </w:p>
+    <w:p>
+      <w:pPr>
+        <w:pStyle w:val="Zkladntext"/>
+      </w:pPr>
+      <w:r>
+        <w:t xml:space="preserve">Overenie riešenia prebiehalo na štyroch úrovniach, ktoré sa líšia tým, čo overujú a akým spôsobom.</w:t>
+      </w:r>
+    </w:p>
+    <w:p>
+      <w:pPr>
+        <w:pStyle w:val="Titulek"/>
+      </w:pPr>
+      <w:r>
+        <w:t xml:space="preserve">Tab. 3.2 [doplniť popis tabuľky]</w:t>
+      </w:r>
+    </w:p>
+    <w:tbl>
+      <w:tblPr>
+        <w:tblW w:w="9069" w:type="dxa"/>
+        <w:tblLayout w:type="fixed"/>
+        <w:tblBorders>
+          <w:top w:val="single" w:sz="4" w:space="0" w:color="auto"/>
+          <w:left w:val="single" w:sz="4" w:space="0" w:color="auto"/>
+          <w:bottom w:val="single" w:sz="4" w:space="0" w:color="auto"/>
+          <w:right w:val="single" w:sz="4" w:space="0" w:color="auto"/>
+          <w:insideH w:val="single" w:sz="4" w:space="0" w:color="auto"/>
+          <w:insideV w:val="single" w:sz="4" w:space="0" w:color="auto"/>
+        </w:tblBorders>
+        <w:tblLook w:val="04A0" w:firstRow="1" w:lastRow="0" w:firstColumn="1" w:lastColumn="0" w:noHBand="0" w:noVBand="1"/>
+      </w:tblPr>
+      <w:tblGrid>
+        <w:gridCol w:w="2302"/>
+        <w:gridCol w:w="3194"/>
+        <w:gridCol w:w="3573"/>
+      </w:tblGrid>
+      <w:tr>
+        <w:trPr>
+          <w:tblHeader/>
+        </w:trPr>
+        <w:tc>
+          <w:tcPr>
+            <w:tcW w:w="2302" w:type="dxa"/>
+          </w:tcPr>
+          <w:p>
+            <w:pPr>
+              <w:pStyle w:val="Zkladntext"/>
+              <w:ind w:firstLine="0" w:left="0" w:right="0"/>
+              <w:spacing w:before="20" w:after="20" w:line="240" w:lineRule="auto"/>
+              <w:jc w:val="center"/>
+            </w:pPr>
+            <w:r>
+              <w:rPr>
+                <w:b/>
+              </w:rPr>
+              <w:t xml:space="preserve">Úroveň</w:t>
+            </w:r>
+          </w:p>
+        </w:tc>
+        <w:tc>
+          <w:tcPr>
+            <w:tcW w:w="3194" w:type="dxa"/>
+          </w:tcPr>
+          <w:p>
+            <w:pPr>
+              <w:pStyle w:val="Zkladntext"/>
+              <w:ind w:firstLine="0" w:left="0" w:right="0"/>
+              <w:spacing w:before="20" w:after="20" w:line="240" w:lineRule="auto"/>
+              <w:jc w:val="center"/>
+            </w:pPr>
+            <w:r>
+              <w:rPr>
+                <w:b/>
+              </w:rPr>
+              <w:t xml:space="preserve">Čo overuje</w:t>
+            </w:r>
+          </w:p>
+        </w:tc>
+        <w:tc>
+          <w:tcPr>
+            <w:tcW w:w="3573" w:type="dxa"/>
+          </w:tcPr>
+          <w:p>
+            <w:pPr>
+              <w:pStyle w:val="Zkladntext"/>
+              <w:ind w:firstLine="0" w:left="0" w:right="0"/>
+              <w:spacing w:before="20" w:after="20" w:line="240" w:lineRule="auto"/>
+              <w:jc w:val="center"/>
+            </w:pPr>
+            <w:r>
+              <w:rPr>
+                <w:b/>
+              </w:rPr>
+              <w:t xml:space="preserve">Spôsob</w:t>
+            </w:r>
+          </w:p>
+        </w:tc>
+      </w:tr>
+      <w:tr>
+        <w:tc>
+          <w:tcPr>
+            <w:tcW w:w="2302" w:type="dxa"/>
+          </w:tcPr>
+          <w:p>
+            <w:pPr>
+              <w:pStyle w:val="Zkladntext"/>
+              <w:ind w:firstLine="0" w:left="0" w:right="0"/>
+              <w:spacing w:before="20" w:after="20" w:line="240" w:lineRule="auto"/>
+              <w:jc w:val="left"/>
+            </w:pPr>
+            <w:r>
+              <w:t xml:space="preserve">Automatizované testy</w:t>
+            </w:r>
+          </w:p>
+        </w:tc>
+        <w:tc>
+          <w:tcPr>
+            <w:tcW w:w="3194" w:type="dxa"/>
+          </w:tcPr>
+          <w:p>
+            <w:pPr>
+              <w:pStyle w:val="Zkladntext"/>
+              <w:ind w:firstLine="0" w:left="0" w:right="0"/>
+              <w:spacing w:before="20" w:after="20" w:line="240" w:lineRule="auto"/>
+              <w:jc w:val="left"/>
+            </w:pPr>
+            <w:r>
+              <w:t xml:space="preserve">Správanie jednotlivých funkcií a vrstiev</w:t>
+            </w:r>
+          </w:p>
+        </w:tc>
+        <w:tc>
+          <w:tcPr>
+            <w:tcW w:w="3573" w:type="dxa"/>
+          </w:tcPr>
+          <w:p>
+            <w:pPr>
+              <w:pStyle w:val="Zkladntext"/>
+              <w:ind w:firstLine="0" w:left="0" w:right="0"/>
+              <w:spacing w:before="20" w:after="20" w:line="240" w:lineRule="auto"/>
+              <w:jc w:val="left"/>
+            </w:pPr>
+            <w:r>
+              <w:t xml:space="preserve">Sada testov spúšťaná nástrojom pytest nad dočasnou databázou</w:t>
+            </w:r>
+          </w:p>
+        </w:tc>
+      </w:tr>
+      <w:tr>
+        <w:tc>
+          <w:tcPr>
+            <w:tcW w:w="2302" w:type="dxa"/>
+          </w:tcPr>
+          <w:p>
+            <w:pPr>
+              <w:pStyle w:val="Zkladntext"/>
+              <w:ind w:firstLine="0" w:left="0" w:right="0"/>
+              <w:spacing w:before="20" w:after="20" w:line="240" w:lineRule="auto"/>
+              <w:jc w:val="left"/>
+            </w:pPr>
+            <w:r>
+              <w:t xml:space="preserve">Referenčné príklady</w:t>
+            </w:r>
+          </w:p>
+        </w:tc>
+        <w:tc>
+          <w:tcPr>
+            <w:tcW w:w="3194" w:type="dxa"/>
+          </w:tcPr>
+          <w:p>
+            <w:pPr>
+              <w:pStyle w:val="Zkladntext"/>
+              <w:ind w:firstLine="0" w:left="0" w:right="0"/>
+              <w:spacing w:before="20" w:after="20" w:line="240" w:lineRule="auto"/>
+              <w:jc w:val="left"/>
+            </w:pPr>
+            <w:r>
+              <w:t xml:space="preserve">Správnosť výpočtu kritickej cesty a metódy PERT</w:t>
+            </w:r>
+          </w:p>
+        </w:tc>
+        <w:tc>
+          <w:tcPr>
+            <w:tcW w:w="3573" w:type="dxa"/>
+          </w:tcPr>
+          <w:p>
+            <w:pPr>
+              <w:pStyle w:val="Zkladntext"/>
+              <w:ind w:firstLine="0" w:left="0" w:right="0"/>
+              <w:spacing w:before="20" w:after="20" w:line="240" w:lineRule="auto"/>
+              <w:jc w:val="left"/>
+            </w:pPr>
+            <w:r>
+              <w:t xml:space="preserve">Porovnanie s hodnotami odvodenými ručne zo vzorcov</w:t>
+            </w:r>
+          </w:p>
+        </w:tc>
+      </w:tr>
+      <w:tr>
+        <w:tc>
+          <w:tcPr>
+            <w:tcW w:w="2302" w:type="dxa"/>
+          </w:tcPr>
+          <w:p>
+            <w:pPr>
+              <w:pStyle w:val="Zkladntext"/>
+              <w:ind w:firstLine="0" w:left="0" w:right="0"/>
+              <w:spacing w:before="20" w:after="20" w:line="240" w:lineRule="auto"/>
+              <w:jc w:val="left"/>
+            </w:pPr>
+            <w:r>
+              <w:t xml:space="preserve">Výkonnostné meranie</w:t>
+            </w:r>
+          </w:p>
+        </w:tc>
+        <w:tc>
+          <w:tcPr>
+            <w:tcW w:w="3194" w:type="dxa"/>
+          </w:tcPr>
+          <w:p>
+            <w:pPr>
+              <w:pStyle w:val="Zkladntext"/>
+              <w:ind w:firstLine="0" w:left="0" w:right="0"/>
+              <w:spacing w:before="20" w:after="20" w:line="240" w:lineRule="auto"/>
+              <w:jc w:val="left"/>
+            </w:pPr>
+            <w:r>
+              <w:t xml:space="preserve">Správanie výpočtu pri rastúcej veľkosti siete</w:t>
+            </w:r>
+          </w:p>
+        </w:tc>
+        <w:tc>
+          <w:tcPr>
+            <w:tcW w:w="3573" w:type="dxa"/>
+          </w:tcPr>
+          <w:p>
+            <w:pPr>
+              <w:pStyle w:val="Zkladntext"/>
+              <w:ind w:firstLine="0" w:left="0" w:right="0"/>
+              <w:spacing w:before="20" w:after="20" w:line="240" w:lineRule="auto"/>
+              <w:jc w:val="left"/>
+            </w:pPr>
+            <w:r>
+              <w:t xml:space="preserve">Opakované meranie času výpočtu, vyhodnotený medián</w:t>
+            </w:r>
+          </w:p>
+        </w:tc>
+      </w:tr>
+      <w:tr>
+        <w:tc>
+          <w:tcPr>
+            <w:tcW w:w="2302" w:type="dxa"/>
+          </w:tcPr>
+          <w:p>
+            <w:pPr>
+              <w:pStyle w:val="Zkladntext"/>
+              <w:ind w:firstLine="0" w:left="0" w:right="0"/>
+              <w:spacing w:before="20" w:after="20" w:line="240" w:lineRule="auto"/>
+              <w:jc w:val="left"/>
+            </w:pPr>
+            <w:r>
+              <w:t xml:space="preserve">Používateľské testovanie</w:t>
+            </w:r>
+          </w:p>
+        </w:tc>
+        <w:tc>
+          <w:tcPr>
+            <w:tcW w:w="3194" w:type="dxa"/>
+          </w:tcPr>
+          <w:p>
+            <w:pPr>
+              <w:pStyle w:val="Zkladntext"/>
+              <w:ind w:firstLine="0" w:left="0" w:right="0"/>
+              <w:spacing w:before="20" w:after="20" w:line="240" w:lineRule="auto"/>
+              <w:jc w:val="left"/>
+            </w:pPr>
+            <w:r>
+              <w:t xml:space="preserve">Použiteľnosť rozhrania pri reálnych úlohách</w:t>
+            </w:r>
+          </w:p>
+        </w:tc>
+        <w:tc>
+          <w:tcPr>
+            <w:tcW w:w="3573" w:type="dxa"/>
+          </w:tcPr>
+          <w:p>
+            <w:pPr>
+              <w:pStyle w:val="Zkladntext"/>
+              <w:ind w:firstLine="0" w:left="0" w:right="0"/>
+              <w:spacing w:before="20" w:after="20" w:line="240" w:lineRule="auto"/>
+              <w:jc w:val="left"/>
+            </w:pPr>
+            <w:r>
+              <w:t xml:space="preserve">Plnenie zadaných úloh a následný dotazník</w:t>
+            </w:r>
+          </w:p>
+        </w:tc>
+      </w:tr>
+    </w:tbl>
+    <w:p>
+      <w:pPr>
+        <w:pStyle w:val="Zkladntext"/>
+      </w:pPr>
+      <w:r>
+        <w:t xml:space="preserve"/>
+      </w:r>
+    </w:p>
+    <w:p>
+      <w:pPr>
+        <w:pStyle w:val="Zkladntext"/>
+      </w:pPr>
+      <w:r>
+        <w:t xml:space="preserve">Kľúčová je druhá úroveň. Automatizované testy overujú, že sa správanie nemení, ale nedokážu potvrdiť, že je správne — ak by bol algoritmus zle navrhnutý, testy by jeho chybu iba zakonzervovali. Preto boli očakávané hodnoty pre referenčné príklady odvodené ručne priamo zo vzorcov, nezávisle od implementácie.</w:t>
+      </w:r>
+    </w:p>
+    <w:p>
+      <w:pPr>
+        <w:pStyle w:val="Zkladntext"/>
+      </w:pPr>
+      <w:r>
+        <w:t xml:space="preserve">Referenčné príklady boli zostavené tak, aby pokryli nielen bežné prípady, ale aj situácie, v ktorých sa algoritmy typicky mýlia: vetvenie a zbiehanie ciest, sieť s viacerými kritickými cestami rovnakej dĺžky, úlohy bez väzieb, závislosť odkazujúca mimo projekt a cyklická závislosť, ktorá musí byť odhalená ešte pred výpočtom.</w:t>
+      </w:r>
+    </w:p>
+    <w:p>
+      <w:pPr>
+        <w:pStyle w:val="Zkladntext"/>
+      </w:pPr>
+      <w:r>
+        <w:t xml:space="preserve">Používateľské testovanie je navrhnuté ako testovanie použiteľnosti so vzorkou 8 až 12 používateľov z cieľovej skupiny. Každý účastník dostane rovnaké zadanie — založiť projekt, vložiť úlohy, nastaviť závislosti, identifikovať kritickú cestu, zmeniť trvanie úlohy a exportovať výsledok. Sleduje sa úspešnosť splnenia, potrebný čas a vzniknuté chyby.</w:t>
+      </w:r>
+    </w:p>
+    <w:p>
+      <w:pPr>
+        <w:pStyle w:val="Zkladntext"/>
+      </w:pPr>
+      <w:r>
+        <w:t xml:space="preserve">Po skončení úloh účastníci vyplnia štandardizovaný dotazník System Usability Scale doplnený o niekoľko vlastných otázok a otvorenú otázku na problémy a návrhy na zlepšenie. Štandardizovaný dotazník bol zvolený preto, že jeho výsledok je porovnateľný s inými systémami, na rozdiel od vlastnej škály.</w:t>
       </w:r>
     </w:p>
     <w:p>
@@ -2493,7 +3319,7 @@
         <w:rPr>
           <w:highlight w:val="yellow"/>
         </w:rPr>
-        <w:t xml:space="preserve">Napísať nanovo — iteratívny postup, prototyp → produkčný systém, spôsob návrhu dátového modelu a architektúry.</w:t>
+        <w:t xml:space="preserve">Po vykonaní testovania doplniť skutočný počet účastníkov, ich zloženie, namerané hodnoty a výsledné skóre.</w:t>
       </w:r>
     </w:p>
     <w:p>
@@ -2501,7 +3327,87 @@
         <w:pStyle w:val="Nadpis2"/>
       </w:pPr>
       <w:r>
-        <w:t xml:space="preserve">Metóda zberu požiadaviek a porovnania nástrojov</w:t>
+        <w:t xml:space="preserve">Metodika ekonomického posúdenia</w:t>
+      </w:r>
+    </w:p>
+    <w:p>
+      <w:pPr>
+        <w:pStyle w:val="Zkladntext"/>
+      </w:pPr>
+      <w:r>
+        <w:t xml:space="preserve">Ekonomické posúdenie je spracované ako modelový príklad pre zvolený typ organizácie, nie ako prognóza trhu. Dôvodom je, že údaje o veľkosti trhu a očakávanom raste nemožno v rámci tejto práce overiť, kým náklady na prevádzku konkrétneho riešenia a odhad ušetreného času overiť možno.</w:t>
+      </w:r>
+    </w:p>
+    <w:p>
+      <w:pPr>
+        <w:pStyle w:val="Zkladntext"/>
+      </w:pPr>
+      <w:r>
+        <w:t xml:space="preserve">Posudzovanou organizáciou je malá firma, ktorá vedie projekty súbežne a plánovanie zabezpečuje bez špecializovaného nástroja. Pre ňu sa porovnáva súčasný spôsob práce so stavom po zavedení systému.</w:t>
+      </w:r>
+    </w:p>
+    <w:p>
+      <w:pPr>
+        <w:pStyle w:val="Zkladntext"/>
+      </w:pPr>
+      <w:r>
+        <w:t xml:space="preserve">Na strane nákladov sa uvažujú tieto položky:</w:t>
+      </w:r>
+    </w:p>
+    <w:p>
+      <w:pPr>
+        <w:pStyle w:val="Seznamsodrkami"/>
+      </w:pPr>
+      <w:r>
+        <w:t xml:space="preserve">obstaranie alebo vývoj riešenia</w:t>
+      </w:r>
+    </w:p>
+    <w:p>
+      <w:pPr>
+        <w:pStyle w:val="Seznamsodrkami"/>
+      </w:pPr>
+      <w:r>
+        <w:t xml:space="preserve">prevádzka cloudových služieb podľa zverejnených cenníkov</w:t>
+      </w:r>
+    </w:p>
+    <w:p>
+      <w:pPr>
+        <w:pStyle w:val="Seznamsodrkami"/>
+      </w:pPr>
+      <w:r>
+        <w:t xml:space="preserve">údržba a aktualizácie</w:t>
+      </w:r>
+    </w:p>
+    <w:p>
+      <w:pPr>
+        <w:pStyle w:val="Seznamsodrkami"/>
+      </w:pPr>
+      <w:r>
+        <w:t xml:space="preserve">zaškolenie používateľov</w:t>
+      </w:r>
+    </w:p>
+    <w:p>
+      <w:pPr>
+        <w:pStyle w:val="Zkladntext"/>
+      </w:pPr>
+      <w:r>
+        <w:t xml:space="preserve">Na strane prínosov sa uvažuje odhadovaná úspora pracovného času spojeného s plánovaním a prepočtom harmonogramu po zmene. Úspora je vyjadrená v hodinách a ocenená hodinovou sadzbou.</w:t>
+      </w:r>
+    </w:p>
+    <w:p>
+      <w:pPr>
+        <w:pStyle w:val="Zkladntext"/>
+      </w:pPr>
+      <w:r>
+        <w:t xml:space="preserve">Keďže úspora času je odhad a nie meranie, výsledok sa neuvádza ako jediné číslo, ale v niekoľkých scenároch — pesimistickom, realistickom a optimistickom. Vstupné hodnoty aj postup výpočtu sú uvedené tak, aby ich bolo možné prepočítať a overiť.</w:t>
+      </w:r>
+    </w:p>
+    <w:p>
+      <w:pPr>
+        <w:pStyle w:val="Zkladntext"/>
+      </w:pPr>
+      <w:r>
+        <w:t xml:space="preserve">Posúdenie má tri obmedzenia, ktoré je potrebné uviesť spolu s výsledkom: vychádza z jedného typu organizácie, úspora času nebola meraná v prevádzke a nezahŕňa náklady na zmenu zabehnutých pracovných postupov.</w:t>
       </w:r>
     </w:p>
     <w:p>
@@ -2519,7 +3425,7 @@
         <w:rPr>
           <w:highlight w:val="yellow"/>
         </w:rPr>
-        <w:t xml:space="preserve">Napísať nanovo — konzultácia s jedným odborníkom z praxe (firmu NEidentifikovať, popísať všeobecne a priznať ako obmedzenie) a kritériá porovnania: cena, offline prevádzka, podpora CPM, sieťový diagram, riadenie zdrojov, spolupráca, exporty, bezpečnosť, náročnosť zavedenia.</w:t>
+        <w:t xml:space="preserve">Doplniť konkrétne vstupné hodnoty — počet zamestnancov, počet súbežných projektov, hodinovú sadzbu a ceny použitých služieb k uvedenému dátumu.</w:t>
       </w:r>
     </w:p>
     <w:p>
@@ -2527,7 +3433,457 @@
         <w:pStyle w:val="Nadpis2"/>
       </w:pPr>
       <w:r>
-        <w:t xml:space="preserve">Metodika testovania a overenia</w:t>
+        <w:t xml:space="preserve">Použitie nástrojov generatívnej umelej inteligencie</w:t>
+      </w:r>
+    </w:p>
+    <w:p>
+      <w:pPr>
+        <w:pStyle w:val="Zkladntext"/>
+      </w:pPr>
+      <w:r>
+        <w:t xml:space="preserve">Pri spracovaní práce boli využité nástroje generatívnej umelej inteligencie. Ich použitie sa riadi pravidlami akademickej integrity a je deklarované v prílohe, na ktorú odkazuje úvod práce.</w:t>
+      </w:r>
+    </w:p>
+    <w:p>
+      <w:pPr>
+        <w:pStyle w:val="Zkladntext"/>
+      </w:pPr>
+      <w:r>
+        <w:t xml:space="preserve">Rozdelenie práce medzi autora a nástroj zhŕňa nasledujúca tabuľka.</w:t>
+      </w:r>
+    </w:p>
+    <w:p>
+      <w:pPr>
+        <w:pStyle w:val="Titulek"/>
+      </w:pPr>
+      <w:r>
+        <w:t xml:space="preserve">Tab. 3.3 [doplniť popis tabuľky]</w:t>
+      </w:r>
+    </w:p>
+    <w:tbl>
+      <w:tblPr>
+        <w:tblW w:w="9069" w:type="dxa"/>
+        <w:tblLayout w:type="fixed"/>
+        <w:tblBorders>
+          <w:top w:val="single" w:sz="4" w:space="0" w:color="auto"/>
+          <w:left w:val="single" w:sz="4" w:space="0" w:color="auto"/>
+          <w:bottom w:val="single" w:sz="4" w:space="0" w:color="auto"/>
+          <w:right w:val="single" w:sz="4" w:space="0" w:color="auto"/>
+          <w:insideH w:val="single" w:sz="4" w:space="0" w:color="auto"/>
+          <w:insideV w:val="single" w:sz="4" w:space="0" w:color="auto"/>
+        </w:tblBorders>
+        <w:tblLook w:val="04A0" w:firstRow="1" w:lastRow="0" w:firstColumn="1" w:lastColumn="0" w:noHBand="0" w:noVBand="1"/>
+      </w:tblPr>
+      <w:tblGrid>
+        <w:gridCol w:w="4997"/>
+        <w:gridCol w:w="4072"/>
+      </w:tblGrid>
+      <w:tr>
+        <w:trPr>
+          <w:tblHeader/>
+        </w:trPr>
+        <w:tc>
+          <w:tcPr>
+            <w:tcW w:w="4997" w:type="dxa"/>
+          </w:tcPr>
+          <w:p>
+            <w:pPr>
+              <w:pStyle w:val="Zkladntext"/>
+              <w:ind w:firstLine="0" w:left="0" w:right="0"/>
+              <w:spacing w:before="20" w:after="20" w:line="240" w:lineRule="auto"/>
+              <w:jc w:val="center"/>
+            </w:pPr>
+            <w:r>
+              <w:rPr>
+                <w:b/>
+              </w:rPr>
+              <w:t xml:space="preserve">Oblasť</w:t>
+            </w:r>
+          </w:p>
+        </w:tc>
+        <w:tc>
+          <w:tcPr>
+            <w:tcW w:w="4072" w:type="dxa"/>
+          </w:tcPr>
+          <w:p>
+            <w:pPr>
+              <w:pStyle w:val="Zkladntext"/>
+              <w:ind w:firstLine="0" w:left="0" w:right="0"/>
+              <w:spacing w:before="20" w:after="20" w:line="240" w:lineRule="auto"/>
+              <w:jc w:val="center"/>
+            </w:pPr>
+            <w:r>
+              <w:rPr>
+                <w:b/>
+              </w:rPr>
+              <w:t xml:space="preserve">Podiel</w:t>
+            </w:r>
+          </w:p>
+        </w:tc>
+      </w:tr>
+      <w:tr>
+        <w:tc>
+          <w:tcPr>
+            <w:tcW w:w="4997" w:type="dxa"/>
+          </w:tcPr>
+          <w:p>
+            <w:pPr>
+              <w:pStyle w:val="Zkladntext"/>
+              <w:ind w:firstLine="0" w:left="0" w:right="0"/>
+              <w:spacing w:before="20" w:after="20" w:line="240" w:lineRule="auto"/>
+              <w:jc w:val="left"/>
+            </w:pPr>
+            <w:r>
+              <w:t xml:space="preserve">Voľba témy a formulácia problému</w:t>
+            </w:r>
+          </w:p>
+        </w:tc>
+        <w:tc>
+          <w:tcPr>
+            <w:tcW w:w="4072" w:type="dxa"/>
+          </w:tcPr>
+          <w:p>
+            <w:pPr>
+              <w:pStyle w:val="Zkladntext"/>
+              <w:ind w:firstLine="0" w:left="0" w:right="0"/>
+              <w:spacing w:before="20" w:after="20" w:line="240" w:lineRule="auto"/>
+              <w:jc w:val="center"/>
+            </w:pPr>
+            <w:r>
+              <w:t xml:space="preserve">autor</w:t>
+            </w:r>
+          </w:p>
+        </w:tc>
+      </w:tr>
+      <w:tr>
+        <w:tc>
+          <w:tcPr>
+            <w:tcW w:w="4997" w:type="dxa"/>
+          </w:tcPr>
+          <w:p>
+            <w:pPr>
+              <w:pStyle w:val="Zkladntext"/>
+              <w:ind w:firstLine="0" w:left="0" w:right="0"/>
+              <w:spacing w:before="20" w:after="20" w:line="240" w:lineRule="auto"/>
+              <w:jc w:val="left"/>
+            </w:pPr>
+            <w:r>
+              <w:t xml:space="preserve">Návrh architektúry a dátového modelu</w:t>
+            </w:r>
+          </w:p>
+        </w:tc>
+        <w:tc>
+          <w:tcPr>
+            <w:tcW w:w="4072" w:type="dxa"/>
+          </w:tcPr>
+          <w:p>
+            <w:pPr>
+              <w:pStyle w:val="Zkladntext"/>
+              <w:ind w:firstLine="0" w:left="0" w:right="0"/>
+              <w:spacing w:before="20" w:after="20" w:line="240" w:lineRule="auto"/>
+              <w:jc w:val="center"/>
+            </w:pPr>
+            <w:r>
+              <w:t xml:space="preserve">autor</w:t>
+            </w:r>
+          </w:p>
+        </w:tc>
+      </w:tr>
+      <w:tr>
+        <w:tc>
+          <w:tcPr>
+            <w:tcW w:w="4997" w:type="dxa"/>
+          </w:tcPr>
+          <w:p>
+            <w:pPr>
+              <w:pStyle w:val="Zkladntext"/>
+              <w:ind w:firstLine="0" w:left="0" w:right="0"/>
+              <w:spacing w:before="20" w:after="20" w:line="240" w:lineRule="auto"/>
+              <w:jc w:val="left"/>
+            </w:pPr>
+            <w:r>
+              <w:t xml:space="preserve">Návrh a overenie výpočtu kritickej cesty</w:t>
+            </w:r>
+          </w:p>
+        </w:tc>
+        <w:tc>
+          <w:tcPr>
+            <w:tcW w:w="4072" w:type="dxa"/>
+          </w:tcPr>
+          <w:p>
+            <w:pPr>
+              <w:pStyle w:val="Zkladntext"/>
+              <w:ind w:firstLine="0" w:left="0" w:right="0"/>
+              <w:spacing w:before="20" w:after="20" w:line="240" w:lineRule="auto"/>
+              <w:jc w:val="center"/>
+            </w:pPr>
+            <w:r>
+              <w:t xml:space="preserve">autor</w:t>
+            </w:r>
+          </w:p>
+        </w:tc>
+      </w:tr>
+      <w:tr>
+        <w:tc>
+          <w:tcPr>
+            <w:tcW w:w="4997" w:type="dxa"/>
+          </w:tcPr>
+          <w:p>
+            <w:pPr>
+              <w:pStyle w:val="Zkladntext"/>
+              <w:ind w:firstLine="0" w:left="0" w:right="0"/>
+              <w:spacing w:before="20" w:after="20" w:line="240" w:lineRule="auto"/>
+              <w:jc w:val="left"/>
+            </w:pPr>
+            <w:r>
+              <w:t xml:space="preserve">Generovanie častí zdrojového kódu a komentárov</w:t>
+            </w:r>
+          </w:p>
+        </w:tc>
+        <w:tc>
+          <w:tcPr>
+            <w:tcW w:w="4072" w:type="dxa"/>
+          </w:tcPr>
+          <w:p>
+            <w:pPr>
+              <w:pStyle w:val="Zkladntext"/>
+              <w:ind w:firstLine="0" w:left="0" w:right="0"/>
+              <w:spacing w:before="20" w:after="20" w:line="240" w:lineRule="auto"/>
+              <w:jc w:val="left"/>
+            </w:pPr>
+            <w:r>
+              <w:t xml:space="preserve">s pomocou nástroja</w:t>
+            </w:r>
+          </w:p>
+        </w:tc>
+      </w:tr>
+      <w:tr>
+        <w:tc>
+          <w:tcPr>
+            <w:tcW w:w="4997" w:type="dxa"/>
+          </w:tcPr>
+          <w:p>
+            <w:pPr>
+              <w:pStyle w:val="Zkladntext"/>
+              <w:ind w:firstLine="0" w:left="0" w:right="0"/>
+              <w:spacing w:before="20" w:after="20" w:line="240" w:lineRule="auto"/>
+              <w:jc w:val="left"/>
+            </w:pPr>
+            <w:r>
+              <w:t xml:space="preserve">Automatizované testy</w:t>
+            </w:r>
+          </w:p>
+        </w:tc>
+        <w:tc>
+          <w:tcPr>
+            <w:tcW w:w="4072" w:type="dxa"/>
+          </w:tcPr>
+          <w:p>
+            <w:pPr>
+              <w:pStyle w:val="Zkladntext"/>
+              <w:ind w:firstLine="0" w:left="0" w:right="0"/>
+              <w:spacing w:before="20" w:after="20" w:line="240" w:lineRule="auto"/>
+              <w:jc w:val="left"/>
+            </w:pPr>
+            <w:r>
+              <w:t xml:space="preserve">s pomocou nástroja, kontrolované spustením</w:t>
+            </w:r>
+          </w:p>
+        </w:tc>
+      </w:tr>
+      <w:tr>
+        <w:tc>
+          <w:tcPr>
+            <w:tcW w:w="4997" w:type="dxa"/>
+          </w:tcPr>
+          <w:p>
+            <w:pPr>
+              <w:pStyle w:val="Zkladntext"/>
+              <w:ind w:firstLine="0" w:left="0" w:right="0"/>
+              <w:spacing w:before="20" w:after="20" w:line="240" w:lineRule="auto"/>
+              <w:jc w:val="left"/>
+            </w:pPr>
+            <w:r>
+              <w:t xml:space="preserve">Technické poznámky k projektu</w:t>
+            </w:r>
+          </w:p>
+        </w:tc>
+        <w:tc>
+          <w:tcPr>
+            <w:tcW w:w="4072" w:type="dxa"/>
+          </w:tcPr>
+          <w:p>
+            <w:pPr>
+              <w:pStyle w:val="Zkladntext"/>
+              <w:ind w:firstLine="0" w:left="0" w:right="0"/>
+              <w:spacing w:before="20" w:after="20" w:line="240" w:lineRule="auto"/>
+              <w:jc w:val="left"/>
+            </w:pPr>
+            <w:r>
+              <w:t xml:space="preserve">s pomocou nástroja</w:t>
+            </w:r>
+          </w:p>
+        </w:tc>
+      </w:tr>
+      <w:tr>
+        <w:tc>
+          <w:tcPr>
+            <w:tcW w:w="4997" w:type="dxa"/>
+          </w:tcPr>
+          <w:p>
+            <w:pPr>
+              <w:pStyle w:val="Zkladntext"/>
+              <w:ind w:firstLine="0" w:left="0" w:right="0"/>
+              <w:spacing w:before="20" w:after="20" w:line="240" w:lineRule="auto"/>
+              <w:jc w:val="left"/>
+            </w:pPr>
+            <w:r>
+              <w:t xml:space="preserve">Rešerš existujúcich nástrojov ako podklad</w:t>
+            </w:r>
+          </w:p>
+        </w:tc>
+        <w:tc>
+          <w:tcPr>
+            <w:tcW w:w="4072" w:type="dxa"/>
+          </w:tcPr>
+          <w:p>
+            <w:pPr>
+              <w:pStyle w:val="Zkladntext"/>
+              <w:ind w:firstLine="0" w:left="0" w:right="0"/>
+              <w:spacing w:before="20" w:after="20" w:line="240" w:lineRule="auto"/>
+              <w:jc w:val="left"/>
+            </w:pPr>
+            <w:r>
+              <w:t xml:space="preserve">s pomocou nástroja</w:t>
+            </w:r>
+          </w:p>
+        </w:tc>
+      </w:tr>
+      <w:tr>
+        <w:tc>
+          <w:tcPr>
+            <w:tcW w:w="4997" w:type="dxa"/>
+          </w:tcPr>
+          <w:p>
+            <w:pPr>
+              <w:pStyle w:val="Zkladntext"/>
+              <w:ind w:firstLine="0" w:left="0" w:right="0"/>
+              <w:spacing w:before="20" w:after="20" w:line="240" w:lineRule="auto"/>
+              <w:jc w:val="left"/>
+            </w:pPr>
+            <w:r>
+              <w:t xml:space="preserve">Spracovanie rešerše do analýzy</w:t>
+            </w:r>
+          </w:p>
+        </w:tc>
+        <w:tc>
+          <w:tcPr>
+            <w:tcW w:w="4072" w:type="dxa"/>
+          </w:tcPr>
+          <w:p>
+            <w:pPr>
+              <w:pStyle w:val="Zkladntext"/>
+              <w:ind w:firstLine="0" w:left="0" w:right="0"/>
+              <w:spacing w:before="20" w:after="20" w:line="240" w:lineRule="auto"/>
+              <w:jc w:val="center"/>
+            </w:pPr>
+            <w:r>
+              <w:t xml:space="preserve">autor</w:t>
+            </w:r>
+          </w:p>
+        </w:tc>
+      </w:tr>
+      <w:tr>
+        <w:tc>
+          <w:tcPr>
+            <w:tcW w:w="4997" w:type="dxa"/>
+          </w:tcPr>
+          <w:p>
+            <w:pPr>
+              <w:pStyle w:val="Zkladntext"/>
+              <w:ind w:firstLine="0" w:left="0" w:right="0"/>
+              <w:spacing w:before="20" w:after="20" w:line="240" w:lineRule="auto"/>
+              <w:jc w:val="center"/>
+            </w:pPr>
+            <w:r>
+              <w:t xml:space="preserve">Text práce</w:t>
+            </w:r>
+          </w:p>
+        </w:tc>
+        <w:tc>
+          <w:tcPr>
+            <w:tcW w:w="4072" w:type="dxa"/>
+          </w:tcPr>
+          <w:p>
+            <w:pPr>
+              <w:pStyle w:val="Zkladntext"/>
+              <w:ind w:firstLine="0" w:left="0" w:right="0"/>
+              <w:spacing w:before="20" w:after="20" w:line="240" w:lineRule="auto"/>
+              <w:jc w:val="center"/>
+            </w:pPr>
+            <w:r>
+              <w:t xml:space="preserve">autor</w:t>
+            </w:r>
+          </w:p>
+        </w:tc>
+      </w:tr>
+      <w:tr>
+        <w:tc>
+          <w:tcPr>
+            <w:tcW w:w="4997" w:type="dxa"/>
+          </w:tcPr>
+          <w:p>
+            <w:pPr>
+              <w:pStyle w:val="Zkladntext"/>
+              <w:ind w:firstLine="0" w:left="0" w:right="0"/>
+              <w:spacing w:before="20" w:after="20" w:line="240" w:lineRule="auto"/>
+              <w:jc w:val="left"/>
+            </w:pPr>
+            <w:r>
+              <w:t xml:space="preserve">Zodpovednosť za správnosť</w:t>
+            </w:r>
+          </w:p>
+        </w:tc>
+        <w:tc>
+          <w:tcPr>
+            <w:tcW w:w="4072" w:type="dxa"/>
+          </w:tcPr>
+          <w:p>
+            <w:pPr>
+              <w:pStyle w:val="Zkladntext"/>
+              <w:ind w:firstLine="0" w:left="0" w:right="0"/>
+              <w:spacing w:before="20" w:after="20" w:line="240" w:lineRule="auto"/>
+              <w:jc w:val="center"/>
+            </w:pPr>
+            <w:r>
+              <w:t xml:space="preserve">autor</w:t>
+            </w:r>
+          </w:p>
+        </w:tc>
+      </w:tr>
+    </w:tbl>
+    <w:p>
+      <w:pPr>
+        <w:pStyle w:val="Zkladntext"/>
+      </w:pPr>
+      <w:r>
+        <w:t xml:space="preserve"/>
+      </w:r>
+    </w:p>
+    <w:p>
+      <w:pPr>
+        <w:pStyle w:val="Zkladntext"/>
+      </w:pPr>
+      <w:r>
+        <w:t xml:space="preserve">Výstupy nástroja neboli preberané bez overenia. Vygenerovaný kód bol overený spustením testov a sledovaním správania aplikácie, tvrdenia prevzaté do textu boli dohľadané v pôvodných zdrojoch a citované z nich, nie z nástroja.</w:t>
+      </w:r>
+    </w:p>
+    <w:p>
+      <w:pPr>
+        <w:pStyle w:val="Zkladntext"/>
+      </w:pPr>
+      <w:r>
+        <w:t xml:space="preserve">Že takáto kontrola nie je formalitou, ukazuje konkrétny prípad. Pri rozširovaní systému sa ukázalo, že migračná rutina spúšťaná pri štarte aplikácie rozhodovala o formáte uloženého hesla podľa dĺžky reťazca. Hash algoritmu bcrypt má kratšiu dĺžku než predpokladaná hranica, takže bol vyhodnotený ako nezahashované heslo a prepísaný — účet sa potom stal neprístupným. Chybu neodhalilo generovanie kódu ani existujúce testy, ale až overenie správania aplikácie po reštarte. Oprava je doložená v histórii verzií a zabezpečená dvoma regresnými testami.</w:t>
       </w:r>
     </w:p>
     <w:p>
@@ -2545,59 +3901,7 @@
         <w:rPr>
           <w:highlight w:val="yellow"/>
         </w:rPr>
-        <w:t xml:space="preserve">Napísať nanovo — úrovne testovania, referenčné príklady, výkonnostné meranie a používateľské testovanie (8–12 používateľov, konkrétne úlohy, dotazník SUS doplnený o vlastné a otvorené otázky).</w:t>
-      </w:r>
-    </w:p>
-    <w:p>
-      <w:pPr>
-        <w:pStyle w:val="Nadpis2"/>
-      </w:pPr>
-      <w:r>
-        <w:t xml:space="preserve">Metodika ekonomického posúdenia</w:t>
-      </w:r>
-    </w:p>
-    <w:p>
-      <w:pPr>
-        <w:pStyle w:val="Zkladntext"/>
-      </w:pPr>
-      <w:r>
-        <w:rPr>
-          <w:b/>
-          <w:highlight w:val="yellow"/>
-        </w:rPr>
-        <w:t xml:space="preserve">[DOPLNIŤ] </w:t>
-      </w:r>
-      <w:r>
-        <w:rPr>
-          <w:highlight w:val="yellow"/>
-        </w:rPr>
-        <w:t xml:space="preserve">Napísať nanovo — modelové posúdenie pre zvolený typ organizácie: nákladové položky, odhad prínosov a scenáre.</w:t>
-      </w:r>
-    </w:p>
-    <w:p>
-      <w:pPr>
-        <w:pStyle w:val="Nadpis2"/>
-      </w:pPr>
-      <w:r>
-        <w:t xml:space="preserve">Použitie nástrojov generatívnej umelej inteligencie</w:t>
-      </w:r>
-    </w:p>
-    <w:p>
-      <w:pPr>
-        <w:pStyle w:val="Zkladntext"/>
-      </w:pPr>
-      <w:r>
-        <w:rPr>
-          <w:b/>
-          <w:highlight w:val="yellow"/>
-        </w:rPr>
-        <w:t xml:space="preserve">[DOPLNIŤ] </w:t>
-      </w:r>
-      <w:r>
-        <w:rPr>
-          <w:highlight w:val="yellow"/>
-        </w:rPr>
-        <w:t xml:space="preserve">Napísať nanovo podľa čl. III smernice — nástroj a verzia, účel, dátum, znenie promptu a spôsob využitia odpovede. Odkázať na prílohu s deklaráciou.</w:t>
+        <w:t xml:space="preserve">Doplniť podľa čl. III smernice presný názov a verziu nástroja, odkaz na webovú stránku, dátumy zadania promptov a ich znenie pri tých častiach práce, kde bol nástroj použitý. Uviesť odkaz na túto prílohu v úvode.</w:t>
       </w:r>
     </w:p>
     <w:p>

</xml_diff>

<commit_message>
docs(bp): vymedzenie problému ako manažérskeho s ekonomickými dôsledkami
Vedúca upozornila, že identifikácia kritických činností nie je sama osebe
ekonomický problém, ale problém projektového riadenia a rozhodovania, ktorý má
ekonomické dôsledky.

Úvod je preto prepísaný tak, že vedie od rozhodovacej situácie vedúceho projektu
k jej merateľným dôsledkom — posunu termínu, kapacite vynaloženej na činnosti
s rezervou a dodatočným nákladom na neskoré zrýchlenie prác. Informačný systém
je predstavený ako prostriedok riešenia, nie ako cieľ práce.

Metodika ekonomického posúdenia na tento reťazec nadväzuje.

Co-Authored-By: Claude Opus 5 <noreply@anthropic.com>
</commit_message>
<xml_diff>
--- a/docs/Bakalarska_praca_Serafin.docx
+++ b/docs/Bakalarska_praca_Serafin.docx
@@ -357,31 +357,97 @@
         <w:pStyle w:val="Zkladntext"/>
       </w:pPr>
       <w:r>
-        <w:t xml:space="preserve">Projektový manažment patrí medzi kľúčové disciplíny moderného podnikania. Nezávisle od odvetvia — či ide o vývoj softvéru, stavebníctvo, konzultačné služby alebo freelancing — každý projekt pozostáva zo série vzájomne závislých úloh, ktoré musia byť splnené v stanovenom čase a v rámci dostupných zdrojov. Nesprávne plánovanie alebo ignorovanie kritických závislostí medzi úlohami vedie k oneskoreniam, prekročeniu rozpočtu a neúspešnému dokončeniu projektov.</w:t>
-      </w:r>
-    </w:p>
-    <w:p>
-      <w:pPr>
-        <w:pStyle w:val="Zkladntext"/>
-      </w:pPr>
-      <w:r>
-        <w:t xml:space="preserve">Napriek existencii početných nástrojov na projektový manažment — od jednoduchých tabuliek v Exceli po komplexné SaaS platformy ako Asana, Jira alebo Monday.com — mnohé z nich nesplňujú potreby malých tímov a freelancerov z niekoľkých dôvodov: sú príliš komplexné pre každodenné použitie, vyžadujú trvalé internetové pripojenie, ukladajú citlivé dáta na vzdialených serveroch, alebo sú finančne nedostupné pre jednotlivcov a malé firmy.</w:t>
-      </w:r>
-    </w:p>
-    <w:p>
-      <w:pPr>
-        <w:pStyle w:val="Zkladntext"/>
-      </w:pPr>
-      <w:r>
-        <w:t xml:space="preserve">Táto práca reaguje na potrebu jednoduchej, lokálnej a bezplatnej desktopovej aplikácie pre projektový manažment, ktorá pritom implementuje matematicky fundované metódy plánovania. Konkrétne ide o implementáciu metódy kritickej cesty (CPM — Critical Path Method), ktorá identifikuje najdlhšiu sekvenciu vzájomne závislých úloh v projekte — tzv. kritickú cestu. Akékoľvek oneskorenie na tejto ceste automaticky predĺži celý projekt.</w:t>
-      </w:r>
-    </w:p>
-    <w:p>
-      <w:pPr>
-        <w:pStyle w:val="Zkladntext"/>
-      </w:pPr>
-      <w:r>
-        <w:t xml:space="preserve">Aplikácia ManagmentApp vznikla postupnou evolúciou: pôvodný prototyp bol navrhnutý ako webová aplikácia na platforme Lovable (PathFlow), následne prepísaný do Pythonu a dokončený ako plnohodnotná desktopová aplikácia s dôrazom na moderný dizajn, robustnosť a rozšíriteľnosť.</w:t>
+        <w:t xml:space="preserve">Každý projekt sa skladá z činností, ktoré na seba nadväzujú. Časť z nich určuje termín dokončenia celého projektu, pretože ich oneskorenie nemá čím byť vykryté. Ostatné činnosti majú časovú rezervu a ich posun termín neohrozí. Rozdiel medzi týmito dvoma skupinami nie je z harmonogramu zrejmý na prvý pohľad a pri väčšom počte vzájomných väzieb ho nemožno spoľahlivo určiť odhadom.</w:t>
+      </w:r>
+    </w:p>
+    <w:p>
+      <w:pPr>
+        <w:pStyle w:val="Zkladntext"/>
+      </w:pPr>
+      <w:r>
+        <w:t xml:space="preserve">Z toho vyplýva rozhodovacia situácia, v ktorej sa vedúci projektu nachádza opakovane. Keď sa niektorá činnosť oneskorí, musí rozhodnúť, či ide o stav vyžadujúci zásah, alebo o posun v rámci rezervy. Keď má obmedzené kapacity, musí rozhodnúť, ktorej činnosti ich prednostne pridelí. Obe rozhodnutia závisia od toho, či pozná činnosti rozhodujúce o termíne.</w:t>
+      </w:r>
+    </w:p>
+    <w:p>
+      <w:pPr>
+        <w:pStyle w:val="Zkladntext"/>
+      </w:pPr>
+      <w:r>
+        <w:t xml:space="preserve">Bez tejto informácie sa rozhoduje podľa iných hľadísk — podľa toho, ktorá činnosť pôsobí naliehavo, alebo ktorá je práve viditeľná. Dôsledky takéhoto rozhodovania sú merateľné a majú ekonomickú povahu:</w:t>
+      </w:r>
+    </w:p>
+    <w:p>
+      <w:pPr>
+        <w:pStyle w:val="Seznamsodrkami"/>
+      </w:pPr>
+      <w:r>
+        <w:t xml:space="preserve">posun termínu dokončenia, ktorý sa prenáša na nadväzujúce záväzky voči zákazníkom</w:t>
+      </w:r>
+    </w:p>
+    <w:p>
+      <w:pPr>
+        <w:pStyle w:val="Seznamsodrkami"/>
+      </w:pPr>
+      <w:r>
+        <w:t xml:space="preserve">vynaložená kapacita na činnosti s rezervou, zatiaľ čo činnosti určujúce termín čakajú</w:t>
+      </w:r>
+    </w:p>
+    <w:p>
+      <w:pPr>
+        <w:pStyle w:val="Seznamsodrkami"/>
+      </w:pPr>
+      <w:r>
+        <w:t xml:space="preserve">dodatočné náklady na zrýchlenie prác v čase, keď je oneskorenie už zjavné a priestor na lacnejšie riešenie pominul</w:t>
+      </w:r>
+    </w:p>
+    <w:p>
+      <w:pPr>
+        <w:pStyle w:val="Zkladntext"/>
+      </w:pPr>
+      <w:r>
+        <w:t xml:space="preserve">Metóda kritickej cesty tento problém rieši výpočtom. Pre každú činnosť určí najskorší a najneskorší možný začiatok a koniec a z nich odvodí časovú rezervu; činnosti s nulovou rezervou tvoria kritickú cestu a určujú trvanie projektu. Vedúci projektu tak dostáva podklad, ktorý odhad nahrádza odvodeným údajom.</w:t>
+      </w:r>
+    </w:p>
+    <w:p>
+      <w:pPr>
+        <w:pStyle w:val="Zkladntext"/>
+      </w:pPr>
+      <w:r>
+        <w:t xml:space="preserve">Výpočet je síce známy od konca päťdesiatych rokov, no jeho prínos sa prejaví až vtedy, keď je dostupný priebežne — teda keď sa po každej zmene v harmonograme prepočíta a výsledok je zrozumiteľne zobrazený. Ručný prepočet túto podmienku nespĺňa a z metódy sa stáva jednorazové cvičenie na začiatku projektu namiesto nástroja priebežného rozhodovania.</w:t>
+      </w:r>
+    </w:p>
+    <w:p>
+      <w:pPr>
+        <w:pStyle w:val="Zkladntext"/>
+      </w:pPr>
+      <w:r>
+        <w:t xml:space="preserve">Práve tu vzniká priestor pre informačný systém. Jeho úlohou nie je nahradiť rozhodovanie vedúceho projektu, ale poskytnúť mu podklad v čase, keď rozhodnutie robí. Informačný systém je preto v tejto práci chápaný ako prostriedok riešenia opísaného problému, nie ako cieľ sám osebe.</w:t>
+      </w:r>
+    </w:p>
+    <w:p>
+      <w:pPr>
+        <w:pStyle w:val="Zkladntext"/>
+      </w:pPr>
+      <w:r>
+        <w:t xml:space="preserve">Dostupné nástroje tento priestor pokrývajú nerovnomerne. Rozšírené nástroje projektového riadenia zobrazujú harmonogram, no kritickú cestu buď nevypočítavajú, alebo ju iba farebne vyznačia bez uvedenia rezerv. Nástroje, ktoré výpočet obsahujú v plnom rozsahu, bývajú buď nákladné, alebo používateľsky náročné do tej miery, že ich zavedenie v menšej organizácii nie je únosné. Podrobné porovnanie podľa stanovených kritérií je predmetom kapitoly 4.</w:t>
+      </w:r>
+    </w:p>
+    <w:p>
+      <w:pPr>
+        <w:pStyle w:val="Zkladntext"/>
+      </w:pPr>
+      <w:r>
+        <w:rPr>
+          <w:b/>
+          <w:highlight w:val="yellow"/>
+        </w:rPr>
+        <w:t xml:space="preserve">[DOPLNIŤ] </w:t>
+      </w:r>
+      <w:r>
+        <w:rPr>
+          <w:highlight w:val="yellow"/>
+        </w:rPr>
+        <w:t xml:space="preserve">Doplniť odkaz na prílohu s deklaráciou použitia nástrojov generatívnej umelej inteligencie (čl. III smernice) a stručnú charakteristiku štruktúry práce, ak nebude samostatnou podkapitolou.</w:t>
       </w:r>
     </w:p>
     <w:p>
@@ -3391,7 +3457,195 @@
         <w:pStyle w:val="Zkladntext"/>
       </w:pPr>
       <w:r>
-        <w:t xml:space="preserve">Na strane prínosov sa uvažuje odhadovaná úspora pracovného času spojeného s plánovaním a prepočtom harmonogramu po zmene. Úspora je vyjadrená v hodinách a ocenená hodinovou sadzbou.</w:t>
+        <w:t xml:space="preserve">Prínosy sa neposudzujú všeobecne, ale sú odvodené priamo od dôsledkov problému vymedzeného v úvode. Každému z nich zodpovedá jedna posudzovaná položka:</w:t>
+      </w:r>
+    </w:p>
+    <w:p>
+      <w:pPr>
+        <w:pStyle w:val="Titulek"/>
+      </w:pPr>
+      <w:r>
+        <w:t xml:space="preserve">Tab. 3.3 [doplniť popis tabuľky]</w:t>
+      </w:r>
+    </w:p>
+    <w:tbl>
+      <w:tblPr>
+        <w:tblW w:w="9069" w:type="dxa"/>
+        <w:tblLayout w:type="fixed"/>
+        <w:tblBorders>
+          <w:top w:val="single" w:sz="4" w:space="0" w:color="auto"/>
+          <w:left w:val="single" w:sz="4" w:space="0" w:color="auto"/>
+          <w:bottom w:val="single" w:sz="4" w:space="0" w:color="auto"/>
+          <w:right w:val="single" w:sz="4" w:space="0" w:color="auto"/>
+          <w:insideH w:val="single" w:sz="4" w:space="0" w:color="auto"/>
+          <w:insideV w:val="single" w:sz="4" w:space="0" w:color="auto"/>
+        </w:tblBorders>
+        <w:tblLook w:val="04A0" w:firstRow="1" w:lastRow="0" w:firstColumn="1" w:lastColumn="0" w:noHBand="0" w:noVBand="1"/>
+      </w:tblPr>
+      <w:tblGrid>
+        <w:gridCol w:w="4750"/>
+        <w:gridCol w:w="4319"/>
+      </w:tblGrid>
+      <w:tr>
+        <w:trPr>
+          <w:tblHeader/>
+        </w:trPr>
+        <w:tc>
+          <w:tcPr>
+            <w:tcW w:w="4750" w:type="dxa"/>
+          </w:tcPr>
+          <w:p>
+            <w:pPr>
+              <w:pStyle w:val="Zkladntext"/>
+              <w:ind w:firstLine="0" w:left="0" w:right="0"/>
+              <w:spacing w:before="20" w:after="20" w:line="240" w:lineRule="auto"/>
+              <w:jc w:val="center"/>
+            </w:pPr>
+            <w:r>
+              <w:rPr>
+                <w:b/>
+              </w:rPr>
+              <w:t xml:space="preserve">Dôsledok problému</w:t>
+            </w:r>
+          </w:p>
+        </w:tc>
+        <w:tc>
+          <w:tcPr>
+            <w:tcW w:w="4319" w:type="dxa"/>
+          </w:tcPr>
+          <w:p>
+            <w:pPr>
+              <w:pStyle w:val="Zkladntext"/>
+              <w:ind w:firstLine="0" w:left="0" w:right="0"/>
+              <w:spacing w:before="20" w:after="20" w:line="240" w:lineRule="auto"/>
+              <w:jc w:val="center"/>
+            </w:pPr>
+            <w:r>
+              <w:rPr>
+                <w:b/>
+              </w:rPr>
+              <w:t xml:space="preserve">Posudzovaný prínos</w:t>
+            </w:r>
+          </w:p>
+        </w:tc>
+      </w:tr>
+      <w:tr>
+        <w:tc>
+          <w:tcPr>
+            <w:tcW w:w="4750" w:type="dxa"/>
+          </w:tcPr>
+          <w:p>
+            <w:pPr>
+              <w:pStyle w:val="Zkladntext"/>
+              <w:ind w:firstLine="0" w:left="0" w:right="0"/>
+              <w:spacing w:before="20" w:after="20" w:line="240" w:lineRule="auto"/>
+              <w:jc w:val="left"/>
+            </w:pPr>
+            <w:r>
+              <w:t xml:space="preserve">Čas strávený ručným prepočtom harmonogramu po zmene</w:t>
+            </w:r>
+          </w:p>
+        </w:tc>
+        <w:tc>
+          <w:tcPr>
+            <w:tcW w:w="4319" w:type="dxa"/>
+          </w:tcPr>
+          <w:p>
+            <w:pPr>
+              <w:pStyle w:val="Zkladntext"/>
+              <w:ind w:firstLine="0" w:left="0" w:right="0"/>
+              <w:spacing w:before="20" w:after="20" w:line="240" w:lineRule="auto"/>
+              <w:jc w:val="left"/>
+            </w:pPr>
+            <w:r>
+              <w:t xml:space="preserve">Úspora pracovného času, vyjadrená v hodinách a ocenená hodinovou sadzbou</w:t>
+            </w:r>
+          </w:p>
+        </w:tc>
+      </w:tr>
+      <w:tr>
+        <w:tc>
+          <w:tcPr>
+            <w:tcW w:w="4750" w:type="dxa"/>
+          </w:tcPr>
+          <w:p>
+            <w:pPr>
+              <w:pStyle w:val="Zkladntext"/>
+              <w:ind w:firstLine="0" w:left="0" w:right="0"/>
+              <w:spacing w:before="20" w:after="20" w:line="240" w:lineRule="auto"/>
+              <w:jc w:val="left"/>
+            </w:pPr>
+            <w:r>
+              <w:t xml:space="preserve">Kapacita vynaložená na činnosti s časovou rezervou</w:t>
+            </w:r>
+          </w:p>
+        </w:tc>
+        <w:tc>
+          <w:tcPr>
+            <w:tcW w:w="4319" w:type="dxa"/>
+          </w:tcPr>
+          <w:p>
+            <w:pPr>
+              <w:pStyle w:val="Zkladntext"/>
+              <w:ind w:firstLine="0" w:left="0" w:right="0"/>
+              <w:spacing w:before="20" w:after="20" w:line="240" w:lineRule="auto"/>
+              <w:jc w:val="left"/>
+            </w:pPr>
+            <w:r>
+              <w:t xml:space="preserve">Presun kapacity na činnosti určujúce termín</w:t>
+            </w:r>
+          </w:p>
+        </w:tc>
+      </w:tr>
+      <w:tr>
+        <w:tc>
+          <w:tcPr>
+            <w:tcW w:w="4750" w:type="dxa"/>
+          </w:tcPr>
+          <w:p>
+            <w:pPr>
+              <w:pStyle w:val="Zkladntext"/>
+              <w:ind w:firstLine="0" w:left="0" w:right="0"/>
+              <w:spacing w:before="20" w:after="20" w:line="240" w:lineRule="auto"/>
+              <w:jc w:val="left"/>
+            </w:pPr>
+            <w:r>
+              <w:t xml:space="preserve">Dodatočné náklady na zrýchlenie prác pri neskorom zistení oneskorenia</w:t>
+            </w:r>
+          </w:p>
+        </w:tc>
+        <w:tc>
+          <w:tcPr>
+            <w:tcW w:w="4319" w:type="dxa"/>
+          </w:tcPr>
+          <w:p>
+            <w:pPr>
+              <w:pStyle w:val="Zkladntext"/>
+              <w:ind w:firstLine="0" w:left="0" w:right="0"/>
+              <w:spacing w:before="20" w:after="20" w:line="240" w:lineRule="auto"/>
+              <w:jc w:val="left"/>
+            </w:pPr>
+            <w:r>
+              <w:t xml:space="preserve">Skoršie rozpoznanie ohrozenia termínu</w:t>
+            </w:r>
+          </w:p>
+        </w:tc>
+      </w:tr>
+    </w:tbl>
+    <w:p>
+      <w:pPr>
+        <w:pStyle w:val="Zkladntext"/>
+      </w:pPr>
+      <w:r>
+        <w:t xml:space="preserve"/>
+      </w:r>
+    </w:p>
+    <w:p>
+      <w:pPr>
+        <w:pStyle w:val="Zkladntext"/>
+      </w:pPr>
+      <w:r>
+        <w:t xml:space="preserve">Kvantifikovaná je len prvá položka, pretože ju možno odvodiť z počtu zmien v harmonograme a času potrebného na prepočet. Zvyšné dve sú uvedené kvalitatívne — ich vyčíslenie by si vyžadovalo údaje o skutočnom priebehu projektov, ktoré v rámci tejto práce nie sú k dispozícii.</w:t>
       </w:r>
     </w:p>
     <w:p>
@@ -3457,7 +3711,7 @@
         <w:pStyle w:val="Titulek"/>
       </w:pPr>
       <w:r>
-        <w:t xml:space="preserve">Tab. 3.3 [doplniť popis tabuľky]</w:t>
+        <w:t xml:space="preserve">Tab. 3.4 [doplniť popis tabuľky]</w:t>
       </w:r>
     </w:p>
     <w:tbl>

</xml_diff>

<commit_message>
docs(bp): teória informačných systémov a kostra ekonomického modelu
Doplnená teoretická podkapitola o informačných systémoch a softvérovej
architektúre — vrstvové usporiadanie, návrhový vzor repozitár a viacnásobné
prenajímanie, s dôrazom na to, prečo oddelenie doménovej vrstvy umožňuje overiť
výpočet nezávisle od databázy a rozhrania.

Ekonomické posúdenie dostalo kostru modelového príkladu: tabuľku vstupných
predpokladov s rozlíšením, ktoré sú doložiteľné cenníkom a ktoré sú odhad,
postup výpočtu úspory a návratnosti a tabuľku troch scenárov.

Vstupné hodnoty, priebeh konzultácie a výsledky používateľského testovania
zostávajú označené — tie môže doplniť len autor.

Co-Authored-By: Claude Opus 5 <noreply@anthropic.com>
</commit_message>
<xml_diff>
--- a/docs/Bakalarska_praca_Serafin.docx
+++ b/docs/Bakalarska_praca_Serafin.docx
@@ -2497,6 +2497,260 @@
         <w:pStyle w:val="Zkladntext"/>
       </w:pPr>
       <w:r>
+        <w:t xml:space="preserve">Informačný systém je v tejto práci chápaný ako celok zložený z dát, postupov ich spracovania a rozhrania, cez ktoré s nimi používateľ pracuje. Pre riešený problém je podstatné, že výpočet kritickej cesty sám osebe hodnotu neprináša — prínos vzniká až vtedy, keď je jeho výsledok dostupný v okamihu rozhodovania.</w:t>
+      </w:r>
+    </w:p>
+    <w:p>
+      <w:pPr>
+        <w:pStyle w:val="Zkladntext"/>
+      </w:pPr>
+      <w:r>
+        <w:t xml:space="preserve">Softvérová architektúra určuje, ako sú tieto časti rozdelené a ako spolu komunikujú. Pri riešení, ktorého jadrom je výpočet, má toto rozdelenie priamy dopad na overiteľnosť: ak je výpočet previazaný s databázou alebo s používateľským rozhraním, nedá sa otestovať samostatne a jeho správnosť nemožno doložiť inak než cez celú aplikáciu.</w:t>
+      </w:r>
+    </w:p>
+    <w:p>
+      <w:pPr>
+        <w:pStyle w:val="Zkladntext"/>
+      </w:pPr>
+      <w:r>
+        <w:t xml:space="preserve">Preto sa používa vrstvové usporiadanie, v ktorom má každá vrstva jednu zodpovednosť a závisí len na vrstve pod sebou:</w:t>
+      </w:r>
+    </w:p>
+    <w:p>
+      <w:pPr>
+        <w:pStyle w:val="Titulek"/>
+      </w:pPr>
+      <w:r>
+        <w:t xml:space="preserve">Tab. 2.5 [doplniť popis tabuľky]</w:t>
+      </w:r>
+    </w:p>
+    <w:tbl>
+      <w:tblPr>
+        <w:tblW w:w="9069" w:type="dxa"/>
+        <w:tblLayout w:type="fixed"/>
+        <w:tblBorders>
+          <w:top w:val="single" w:sz="4" w:space="0" w:color="auto"/>
+          <w:left w:val="single" w:sz="4" w:space="0" w:color="auto"/>
+          <w:bottom w:val="single" w:sz="4" w:space="0" w:color="auto"/>
+          <w:right w:val="single" w:sz="4" w:space="0" w:color="auto"/>
+          <w:insideH w:val="single" w:sz="4" w:space="0" w:color="auto"/>
+          <w:insideV w:val="single" w:sz="4" w:space="0" w:color="auto"/>
+        </w:tblBorders>
+        <w:tblLook w:val="04A0" w:firstRow="1" w:lastRow="0" w:firstColumn="1" w:lastColumn="0" w:noHBand="0" w:noVBand="1"/>
+      </w:tblPr>
+      <w:tblGrid>
+        <w:gridCol w:w="3076"/>
+        <w:gridCol w:w="5993"/>
+      </w:tblGrid>
+      <w:tr>
+        <w:trPr>
+          <w:tblHeader/>
+        </w:trPr>
+        <w:tc>
+          <w:tcPr>
+            <w:tcW w:w="3076" w:type="dxa"/>
+          </w:tcPr>
+          <w:p>
+            <w:pPr>
+              <w:pStyle w:val="Zkladntext"/>
+              <w:ind w:firstLine="0" w:left="0" w:right="0"/>
+              <w:spacing w:before="20" w:after="20" w:line="240" w:lineRule="auto"/>
+              <w:jc w:val="center"/>
+            </w:pPr>
+            <w:r>
+              <w:rPr>
+                <w:b/>
+              </w:rPr>
+              <w:t xml:space="preserve">Vrstva</w:t>
+            </w:r>
+          </w:p>
+        </w:tc>
+        <w:tc>
+          <w:tcPr>
+            <w:tcW w:w="5993" w:type="dxa"/>
+          </w:tcPr>
+          <w:p>
+            <w:pPr>
+              <w:pStyle w:val="Zkladntext"/>
+              <w:ind w:firstLine="0" w:left="0" w:right="0"/>
+              <w:spacing w:before="20" w:after="20" w:line="240" w:lineRule="auto"/>
+              <w:jc w:val="center"/>
+            </w:pPr>
+            <w:r>
+              <w:rPr>
+                <w:b/>
+              </w:rPr>
+              <w:t xml:space="preserve">Zodpovednosť</w:t>
+            </w:r>
+          </w:p>
+        </w:tc>
+      </w:tr>
+      <w:tr>
+        <w:tc>
+          <w:tcPr>
+            <w:tcW w:w="3076" w:type="dxa"/>
+          </w:tcPr>
+          <w:p>
+            <w:pPr>
+              <w:pStyle w:val="Zkladntext"/>
+              <w:ind w:firstLine="0" w:left="0" w:right="0"/>
+              <w:spacing w:before="20" w:after="20" w:line="240" w:lineRule="auto"/>
+              <w:jc w:val="center"/>
+            </w:pPr>
+            <w:r>
+              <w:t xml:space="preserve">Prezentačná</w:t>
+            </w:r>
+          </w:p>
+        </w:tc>
+        <w:tc>
+          <w:tcPr>
+            <w:tcW w:w="5993" w:type="dxa"/>
+          </w:tcPr>
+          <w:p>
+            <w:pPr>
+              <w:pStyle w:val="Zkladntext"/>
+              <w:ind w:firstLine="0" w:left="0" w:right="0"/>
+              <w:spacing w:before="20" w:after="20" w:line="240" w:lineRule="auto"/>
+              <w:jc w:val="left"/>
+            </w:pPr>
+            <w:r>
+              <w:t xml:space="preserve">Zobrazenie údajov a zachytenie vstupu od používateľa</w:t>
+            </w:r>
+          </w:p>
+        </w:tc>
+      </w:tr>
+      <w:tr>
+        <w:tc>
+          <w:tcPr>
+            <w:tcW w:w="3076" w:type="dxa"/>
+          </w:tcPr>
+          <w:p>
+            <w:pPr>
+              <w:pStyle w:val="Zkladntext"/>
+              <w:ind w:firstLine="0" w:left="0" w:right="0"/>
+              <w:spacing w:before="20" w:after="20" w:line="240" w:lineRule="auto"/>
+              <w:jc w:val="center"/>
+            </w:pPr>
+            <w:r>
+              <w:t xml:space="preserve">Aplikačná</w:t>
+            </w:r>
+          </w:p>
+        </w:tc>
+        <w:tc>
+          <w:tcPr>
+            <w:tcW w:w="5993" w:type="dxa"/>
+          </w:tcPr>
+          <w:p>
+            <w:pPr>
+              <w:pStyle w:val="Zkladntext"/>
+              <w:ind w:firstLine="0" w:left="0" w:right="0"/>
+              <w:spacing w:before="20" w:after="20" w:line="240" w:lineRule="auto"/>
+              <w:jc w:val="left"/>
+            </w:pPr>
+            <w:r>
+              <w:t xml:space="preserve">Sprístupnenie operácií, overenie oprávnení a vstupov</w:t>
+            </w:r>
+          </w:p>
+        </w:tc>
+      </w:tr>
+      <w:tr>
+        <w:tc>
+          <w:tcPr>
+            <w:tcW w:w="3076" w:type="dxa"/>
+          </w:tcPr>
+          <w:p>
+            <w:pPr>
+              <w:pStyle w:val="Zkladntext"/>
+              <w:ind w:firstLine="0" w:left="0" w:right="0"/>
+              <w:spacing w:before="20" w:after="20" w:line="240" w:lineRule="auto"/>
+              <w:jc w:val="center"/>
+            </w:pPr>
+            <w:r>
+              <w:t xml:space="preserve">Doménová</w:t>
+            </w:r>
+          </w:p>
+        </w:tc>
+        <w:tc>
+          <w:tcPr>
+            <w:tcW w:w="5993" w:type="dxa"/>
+          </w:tcPr>
+          <w:p>
+            <w:pPr>
+              <w:pStyle w:val="Zkladntext"/>
+              <w:ind w:firstLine="0" w:left="0" w:right="0"/>
+              <w:spacing w:before="20" w:after="20" w:line="240" w:lineRule="auto"/>
+              <w:jc w:val="left"/>
+            </w:pPr>
+            <w:r>
+              <w:t xml:space="preserve">Výpočty a pravidlá riešenej oblasti — tu leží metóda kritickej cesty</w:t>
+            </w:r>
+          </w:p>
+        </w:tc>
+      </w:tr>
+      <w:tr>
+        <w:tc>
+          <w:tcPr>
+            <w:tcW w:w="3076" w:type="dxa"/>
+          </w:tcPr>
+          <w:p>
+            <w:pPr>
+              <w:pStyle w:val="Zkladntext"/>
+              <w:ind w:firstLine="0" w:left="0" w:right="0"/>
+              <w:spacing w:before="20" w:after="20" w:line="240" w:lineRule="auto"/>
+              <w:jc w:val="center"/>
+            </w:pPr>
+            <w:r>
+              <w:t xml:space="preserve">Dátová</w:t>
+            </w:r>
+          </w:p>
+        </w:tc>
+        <w:tc>
+          <w:tcPr>
+            <w:tcW w:w="5993" w:type="dxa"/>
+          </w:tcPr>
+          <w:p>
+            <w:pPr>
+              <w:pStyle w:val="Zkladntext"/>
+              <w:ind w:firstLine="0" w:left="0" w:right="0"/>
+              <w:spacing w:before="20" w:after="20" w:line="240" w:lineRule="auto"/>
+              <w:jc w:val="left"/>
+            </w:pPr>
+            <w:r>
+              <w:t xml:space="preserve">Uloženie a načítanie údajov</w:t>
+            </w:r>
+          </w:p>
+        </w:tc>
+      </w:tr>
+    </w:tbl>
+    <w:p>
+      <w:pPr>
+        <w:pStyle w:val="Zkladntext"/>
+      </w:pPr>
+      <w:r>
+        <w:t xml:space="preserve"/>
+      </w:r>
+    </w:p>
+    <w:p>
+      <w:pPr>
+        <w:pStyle w:val="Zkladntext"/>
+      </w:pPr>
+      <w:r>
+        <w:t xml:space="preserve">Kľúčové je, že doménová vrstva nepozná ani databázu, ani rozhranie. Vďaka tomu sa dá výpočet spustiť nad dátami zadanými priamo v teste a porovnať s hodnotami odvodenými ručne — čo je postup použitý pri overení v kapitole 7.</w:t>
+      </w:r>
+    </w:p>
+    <w:p>
+      <w:pPr>
+        <w:pStyle w:val="Zkladntext"/>
+      </w:pPr>
+      <w:r>
+        <w:t xml:space="preserve">Prístup k dátam je sústredený do samostatných modulov podľa návrhového vzoru repozitár. Zvyšok aplikácie potom pracuje s údajmi cez pomenované operácie a nie cez databázové dopyty, takže zmena úložiska nevyžaduje zásah do výpočtovej ani prezentačnej vrstvy.</w:t>
+      </w:r>
+    </w:p>
+    <w:p>
+      <w:pPr>
+        <w:pStyle w:val="Zkladntext"/>
+      </w:pPr>
+      <w:r>
         <w:rPr>
           <w:b/>
           <w:highlight w:val="yellow"/>
@@ -2507,7 +2761,33 @@
         <w:rPr>
           <w:highlight w:val="yellow"/>
         </w:rPr>
-        <w:t xml:space="preserve">Napísať nanovo — teoretický základ pre návrh vlastného riešenia.</w:t>
+        <w:t xml:space="preserve">Doplniť citáciu k návrhovému vzoru repozitár — v zozname literatúry je Fowler (2002), overiť konkrétnu stranu.</w:t>
+      </w:r>
+    </w:p>
+    <w:p>
+      <w:pPr>
+        <w:pStyle w:val="Zkladntext"/>
+      </w:pPr>
+      <w:r>
+        <w:t xml:space="preserve">Samostatnou otázkou je viacnásobné prenajímanie, teda súbežná prevádzka pre viacero organizácií nad jednou inštaláciou. Údaje každej organizácie musia byť oddelené tak, aby sa k nim iná organizácia nedostala ani omylom, ani zámerne. Oddelenie sa dá riešiť samostatnou databázou pre každú organizáciu, samostatnou schémou, alebo spoločnými tabuľkami s identifikátorom organizácie v každom zázname. Posledný prístup je prevádzkovo najjednoduchší, ale kladie najvyššie nároky na dôslednosť — zabudnutá podmienka v jedinom dopyte znamená únik dát medzi organizáciami.</w:t>
+      </w:r>
+    </w:p>
+    <w:p>
+      <w:pPr>
+        <w:pStyle w:val="Zkladntext"/>
+      </w:pPr>
+      <w:r>
+        <w:rPr>
+          <w:b/>
+          <w:highlight w:val="yellow"/>
+        </w:rPr>
+        <w:t xml:space="preserve">[DOPLNIŤ] </w:t>
+      </w:r>
+      <w:r>
+        <w:rPr>
+          <w:highlight w:val="yellow"/>
+        </w:rPr>
+        <w:t xml:space="preserve">Doplniť odborné zdroje k vrstvovej architektúre, návrhu informačných systémov a viacnásobnému prenajímaniu. Ide o teoretickú kapitolu, takže tvrdenia musia byť podložené literatúrou s ISBN/ISSN, nie odkazmi na dokumentáciu nástrojov.</w:t>
       </w:r>
     </w:p>
     <w:p>
@@ -20841,6 +21121,810 @@
         <w:pStyle w:val="Zkladntext"/>
       </w:pPr>
       <w:r>
+        <w:t xml:space="preserve">Posudzovanou organizáciou je malá firma, ktorá vedie niekoľko projektov súbežne a plánovanie zabezpečuje bez špecializovaného nástroja. Porovnáva sa súčasný stav so stavom po zavedení systému.</w:t>
+      </w:r>
+    </w:p>
+    <w:p>
+      <w:pPr>
+        <w:pStyle w:val="Zkladntext"/>
+      </w:pPr>
+      <w:r>
+        <w:t xml:space="preserve">Vstupné predpoklady modelu sú uvedené v nasledujúcej tabuľke. Každý z nich je buď doložiteľný cenníkom poskytovateľa, alebo ide o odhad, ktorý je ako odhad aj označený.</w:t>
+      </w:r>
+    </w:p>
+    <w:p>
+      <w:pPr>
+        <w:pStyle w:val="Titulek"/>
+      </w:pPr>
+      <w:r>
+        <w:t xml:space="preserve">Tab. 8.2 [doplniť popis tabuľky]</w:t>
+      </w:r>
+    </w:p>
+    <w:tbl>
+      <w:tblPr>
+        <w:tblW w:w="9068" w:type="dxa"/>
+        <w:tblLayout w:type="fixed"/>
+        <w:tblBorders>
+          <w:top w:val="single" w:sz="4" w:space="0" w:color="auto"/>
+          <w:left w:val="single" w:sz="4" w:space="0" w:color="auto"/>
+          <w:bottom w:val="single" w:sz="4" w:space="0" w:color="auto"/>
+          <w:right w:val="single" w:sz="4" w:space="0" w:color="auto"/>
+          <w:insideH w:val="single" w:sz="4" w:space="0" w:color="auto"/>
+          <w:insideV w:val="single" w:sz="4" w:space="0" w:color="auto"/>
+        </w:tblBorders>
+        <w:tblLook w:val="04A0" w:firstRow="1" w:lastRow="0" w:firstColumn="1" w:lastColumn="0" w:noHBand="0" w:noVBand="1"/>
+      </w:tblPr>
+      <w:tblGrid>
+        <w:gridCol w:w="4152"/>
+        <w:gridCol w:w="2351"/>
+        <w:gridCol w:w="2565"/>
+      </w:tblGrid>
+      <w:tr>
+        <w:trPr>
+          <w:tblHeader/>
+        </w:trPr>
+        <w:tc>
+          <w:tcPr>
+            <w:tcW w:w="4152" w:type="dxa"/>
+          </w:tcPr>
+          <w:p>
+            <w:pPr>
+              <w:pStyle w:val="Zkladntext"/>
+              <w:ind w:firstLine="0" w:left="0" w:right="0"/>
+              <w:spacing w:before="20" w:after="20" w:line="240" w:lineRule="auto"/>
+              <w:jc w:val="center"/>
+            </w:pPr>
+            <w:r>
+              <w:rPr>
+                <w:b/>
+              </w:rPr>
+              <w:t xml:space="preserve">Veličina</w:t>
+            </w:r>
+          </w:p>
+        </w:tc>
+        <w:tc>
+          <w:tcPr>
+            <w:tcW w:w="2351" w:type="dxa"/>
+          </w:tcPr>
+          <w:p>
+            <w:pPr>
+              <w:pStyle w:val="Zkladntext"/>
+              <w:ind w:firstLine="0" w:left="0" w:right="0"/>
+              <w:spacing w:before="20" w:after="20" w:line="240" w:lineRule="auto"/>
+              <w:jc w:val="center"/>
+            </w:pPr>
+            <w:r>
+              <w:rPr>
+                <w:b/>
+              </w:rPr>
+              <w:t xml:space="preserve">Hodnota</w:t>
+            </w:r>
+          </w:p>
+        </w:tc>
+        <w:tc>
+          <w:tcPr>
+            <w:tcW w:w="2565" w:type="dxa"/>
+          </w:tcPr>
+          <w:p>
+            <w:pPr>
+              <w:pStyle w:val="Zkladntext"/>
+              <w:ind w:firstLine="0" w:left="0" w:right="0"/>
+              <w:spacing w:before="20" w:after="20" w:line="240" w:lineRule="auto"/>
+              <w:jc w:val="center"/>
+            </w:pPr>
+            <w:r>
+              <w:rPr>
+                <w:b/>
+              </w:rPr>
+              <w:t xml:space="preserve">Zdroj</w:t>
+            </w:r>
+          </w:p>
+        </w:tc>
+      </w:tr>
+      <w:tr>
+        <w:tc>
+          <w:tcPr>
+            <w:tcW w:w="4152" w:type="dxa"/>
+          </w:tcPr>
+          <w:p>
+            <w:pPr>
+              <w:pStyle w:val="Zkladntext"/>
+              <w:ind w:firstLine="0" w:left="0" w:right="0"/>
+              <w:spacing w:before="20" w:after="20" w:line="240" w:lineRule="auto"/>
+              <w:jc w:val="left"/>
+            </w:pPr>
+            <w:r>
+              <w:t xml:space="preserve">Počet zamestnancov podieľajúcich sa na plánovaní</w:t>
+            </w:r>
+          </w:p>
+        </w:tc>
+        <w:tc>
+          <w:tcPr>
+            <w:tcW w:w="2351" w:type="dxa"/>
+          </w:tcPr>
+          <w:p>
+            <w:pPr>
+              <w:pStyle w:val="Zkladntext"/>
+              <w:ind w:firstLine="0" w:left="0" w:right="0"/>
+              <w:spacing w:before="20" w:after="20" w:line="240" w:lineRule="auto"/>
+              <w:jc w:val="center"/>
+            </w:pPr>
+            <w:r>
+              <w:t xml:space="preserve">[doplniť]</w:t>
+            </w:r>
+          </w:p>
+        </w:tc>
+        <w:tc>
+          <w:tcPr>
+            <w:tcW w:w="2565" w:type="dxa"/>
+          </w:tcPr>
+          <w:p>
+            <w:pPr>
+              <w:pStyle w:val="Zkladntext"/>
+              <w:ind w:firstLine="0" w:left="0" w:right="0"/>
+              <w:spacing w:before="20" w:after="20" w:line="240" w:lineRule="auto"/>
+              <w:jc w:val="left"/>
+            </w:pPr>
+            <w:r>
+              <w:t xml:space="preserve">predpoklad modelu</w:t>
+            </w:r>
+          </w:p>
+        </w:tc>
+      </w:tr>
+      <w:tr>
+        <w:tc>
+          <w:tcPr>
+            <w:tcW w:w="4152" w:type="dxa"/>
+          </w:tcPr>
+          <w:p>
+            <w:pPr>
+              <w:pStyle w:val="Zkladntext"/>
+              <w:ind w:firstLine="0" w:left="0" w:right="0"/>
+              <w:spacing w:before="20" w:after="20" w:line="240" w:lineRule="auto"/>
+              <w:jc w:val="left"/>
+            </w:pPr>
+            <w:r>
+              <w:t xml:space="preserve">Počet súbežne vedených projektov</w:t>
+            </w:r>
+          </w:p>
+        </w:tc>
+        <w:tc>
+          <w:tcPr>
+            <w:tcW w:w="2351" w:type="dxa"/>
+          </w:tcPr>
+          <w:p>
+            <w:pPr>
+              <w:pStyle w:val="Zkladntext"/>
+              <w:ind w:firstLine="0" w:left="0" w:right="0"/>
+              <w:spacing w:before="20" w:after="20" w:line="240" w:lineRule="auto"/>
+              <w:jc w:val="center"/>
+            </w:pPr>
+            <w:r>
+              <w:t xml:space="preserve">[doplniť]</w:t>
+            </w:r>
+          </w:p>
+        </w:tc>
+        <w:tc>
+          <w:tcPr>
+            <w:tcW w:w="2565" w:type="dxa"/>
+          </w:tcPr>
+          <w:p>
+            <w:pPr>
+              <w:pStyle w:val="Zkladntext"/>
+              <w:ind w:firstLine="0" w:left="0" w:right="0"/>
+              <w:spacing w:before="20" w:after="20" w:line="240" w:lineRule="auto"/>
+              <w:jc w:val="left"/>
+            </w:pPr>
+            <w:r>
+              <w:t xml:space="preserve">predpoklad modelu</w:t>
+            </w:r>
+          </w:p>
+        </w:tc>
+      </w:tr>
+      <w:tr>
+        <w:tc>
+          <w:tcPr>
+            <w:tcW w:w="4152" w:type="dxa"/>
+          </w:tcPr>
+          <w:p>
+            <w:pPr>
+              <w:pStyle w:val="Zkladntext"/>
+              <w:ind w:firstLine="0" w:left="0" w:right="0"/>
+              <w:spacing w:before="20" w:after="20" w:line="240" w:lineRule="auto"/>
+              <w:jc w:val="left"/>
+            </w:pPr>
+            <w:r>
+              <w:t xml:space="preserve">Priemerný počet zmien v harmonograme za mesiac</w:t>
+            </w:r>
+          </w:p>
+        </w:tc>
+        <w:tc>
+          <w:tcPr>
+            <w:tcW w:w="2351" w:type="dxa"/>
+          </w:tcPr>
+          <w:p>
+            <w:pPr>
+              <w:pStyle w:val="Zkladntext"/>
+              <w:ind w:firstLine="0" w:left="0" w:right="0"/>
+              <w:spacing w:before="20" w:after="20" w:line="240" w:lineRule="auto"/>
+              <w:jc w:val="center"/>
+            </w:pPr>
+            <w:r>
+              <w:t xml:space="preserve">[doplniť]</w:t>
+            </w:r>
+          </w:p>
+        </w:tc>
+        <w:tc>
+          <w:tcPr>
+            <w:tcW w:w="2565" w:type="dxa"/>
+          </w:tcPr>
+          <w:p>
+            <w:pPr>
+              <w:pStyle w:val="Zkladntext"/>
+              <w:ind w:firstLine="0" w:left="0" w:right="0"/>
+              <w:spacing w:before="20" w:after="20" w:line="240" w:lineRule="auto"/>
+              <w:jc w:val="center"/>
+            </w:pPr>
+            <w:r>
+              <w:t xml:space="preserve">odhad</w:t>
+            </w:r>
+          </w:p>
+        </w:tc>
+      </w:tr>
+      <w:tr>
+        <w:tc>
+          <w:tcPr>
+            <w:tcW w:w="4152" w:type="dxa"/>
+          </w:tcPr>
+          <w:p>
+            <w:pPr>
+              <w:pStyle w:val="Zkladntext"/>
+              <w:ind w:firstLine="0" w:left="0" w:right="0"/>
+              <w:spacing w:before="20" w:after="20" w:line="240" w:lineRule="auto"/>
+              <w:jc w:val="left"/>
+            </w:pPr>
+            <w:r>
+              <w:t xml:space="preserve">Čas na ručný prepočet harmonogramu po zmene</w:t>
+            </w:r>
+          </w:p>
+        </w:tc>
+        <w:tc>
+          <w:tcPr>
+            <w:tcW w:w="2351" w:type="dxa"/>
+          </w:tcPr>
+          <w:p>
+            <w:pPr>
+              <w:pStyle w:val="Zkladntext"/>
+              <w:ind w:firstLine="0" w:left="0" w:right="0"/>
+              <w:spacing w:before="20" w:after="20" w:line="240" w:lineRule="auto"/>
+              <w:jc w:val="left"/>
+            </w:pPr>
+            <w:r>
+              <w:t xml:space="preserve">[doplniť] min</w:t>
+            </w:r>
+          </w:p>
+        </w:tc>
+        <w:tc>
+          <w:tcPr>
+            <w:tcW w:w="2565" w:type="dxa"/>
+          </w:tcPr>
+          <w:p>
+            <w:pPr>
+              <w:pStyle w:val="Zkladntext"/>
+              <w:ind w:firstLine="0" w:left="0" w:right="0"/>
+              <w:spacing w:before="20" w:after="20" w:line="240" w:lineRule="auto"/>
+              <w:jc w:val="center"/>
+            </w:pPr>
+            <w:r>
+              <w:t xml:space="preserve">odhad</w:t>
+            </w:r>
+          </w:p>
+        </w:tc>
+      </w:tr>
+      <w:tr>
+        <w:tc>
+          <w:tcPr>
+            <w:tcW w:w="4152" w:type="dxa"/>
+          </w:tcPr>
+          <w:p>
+            <w:pPr>
+              <w:pStyle w:val="Zkladntext"/>
+              <w:ind w:firstLine="0" w:left="0" w:right="0"/>
+              <w:spacing w:before="20" w:after="20" w:line="240" w:lineRule="auto"/>
+              <w:jc w:val="left"/>
+            </w:pPr>
+            <w:r>
+              <w:t xml:space="preserve">Hodinová sadzba</w:t>
+            </w:r>
+          </w:p>
+        </w:tc>
+        <w:tc>
+          <w:tcPr>
+            <w:tcW w:w="2351" w:type="dxa"/>
+          </w:tcPr>
+          <w:p>
+            <w:pPr>
+              <w:pStyle w:val="Zkladntext"/>
+              <w:ind w:firstLine="0" w:left="0" w:right="0"/>
+              <w:spacing w:before="20" w:after="20" w:line="240" w:lineRule="auto"/>
+              <w:jc w:val="center"/>
+            </w:pPr>
+            <w:r>
+              <w:t xml:space="preserve">[doplniť] €</w:t>
+            </w:r>
+          </w:p>
+        </w:tc>
+        <w:tc>
+          <w:tcPr>
+            <w:tcW w:w="2565" w:type="dxa"/>
+          </w:tcPr>
+          <w:p>
+            <w:pPr>
+              <w:pStyle w:val="Zkladntext"/>
+              <w:ind w:firstLine="0" w:left="0" w:right="0"/>
+              <w:spacing w:before="20" w:after="20" w:line="240" w:lineRule="auto"/>
+              <w:jc w:val="left"/>
+            </w:pPr>
+            <w:r>
+              <w:t xml:space="preserve">doplniť zdroj a dátum</w:t>
+            </w:r>
+          </w:p>
+        </w:tc>
+      </w:tr>
+      <w:tr>
+        <w:tc>
+          <w:tcPr>
+            <w:tcW w:w="4152" w:type="dxa"/>
+          </w:tcPr>
+          <w:p>
+            <w:pPr>
+              <w:pStyle w:val="Zkladntext"/>
+              <w:ind w:firstLine="0" w:left="0" w:right="0"/>
+              <w:spacing w:before="20" w:after="20" w:line="240" w:lineRule="auto"/>
+              <w:jc w:val="left"/>
+            </w:pPr>
+            <w:r>
+              <w:t xml:space="preserve">Mesačné náklady na cloudové služby</w:t>
+            </w:r>
+          </w:p>
+        </w:tc>
+        <w:tc>
+          <w:tcPr>
+            <w:tcW w:w="2351" w:type="dxa"/>
+          </w:tcPr>
+          <w:p>
+            <w:pPr>
+              <w:pStyle w:val="Zkladntext"/>
+              <w:ind w:firstLine="0" w:left="0" w:right="0"/>
+              <w:spacing w:before="20" w:after="20" w:line="240" w:lineRule="auto"/>
+              <w:jc w:val="center"/>
+            </w:pPr>
+            <w:r>
+              <w:t xml:space="preserve">[doplniť] €</w:t>
+            </w:r>
+          </w:p>
+        </w:tc>
+        <w:tc>
+          <w:tcPr>
+            <w:tcW w:w="2565" w:type="dxa"/>
+          </w:tcPr>
+          <w:p>
+            <w:pPr>
+              <w:pStyle w:val="Zkladntext"/>
+              <w:ind w:firstLine="0" w:left="0" w:right="0"/>
+              <w:spacing w:before="20" w:after="20" w:line="240" w:lineRule="auto"/>
+              <w:jc w:val="left"/>
+            </w:pPr>
+            <w:r>
+              <w:t xml:space="preserve">cenník, doplniť dátum</w:t>
+            </w:r>
+          </w:p>
+        </w:tc>
+      </w:tr>
+      <w:tr>
+        <w:tc>
+          <w:tcPr>
+            <w:tcW w:w="4152" w:type="dxa"/>
+          </w:tcPr>
+          <w:p>
+            <w:pPr>
+              <w:pStyle w:val="Zkladntext"/>
+              <w:ind w:firstLine="0" w:left="0" w:right="0"/>
+              <w:spacing w:before="20" w:after="20" w:line="240" w:lineRule="auto"/>
+              <w:jc w:val="left"/>
+            </w:pPr>
+            <w:r>
+              <w:t xml:space="preserve">Jednorazové náklady na zaškolenie</w:t>
+            </w:r>
+          </w:p>
+        </w:tc>
+        <w:tc>
+          <w:tcPr>
+            <w:tcW w:w="2351" w:type="dxa"/>
+          </w:tcPr>
+          <w:p>
+            <w:pPr>
+              <w:pStyle w:val="Zkladntext"/>
+              <w:ind w:firstLine="0" w:left="0" w:right="0"/>
+              <w:spacing w:before="20" w:after="20" w:line="240" w:lineRule="auto"/>
+              <w:jc w:val="center"/>
+            </w:pPr>
+            <w:r>
+              <w:t xml:space="preserve">[doplniť] €</w:t>
+            </w:r>
+          </w:p>
+        </w:tc>
+        <w:tc>
+          <w:tcPr>
+            <w:tcW w:w="2565" w:type="dxa"/>
+          </w:tcPr>
+          <w:p>
+            <w:pPr>
+              <w:pStyle w:val="Zkladntext"/>
+              <w:ind w:firstLine="0" w:left="0" w:right="0"/>
+              <w:spacing w:before="20" w:after="20" w:line="240" w:lineRule="auto"/>
+              <w:jc w:val="center"/>
+            </w:pPr>
+            <w:r>
+              <w:t xml:space="preserve">odhad</w:t>
+            </w:r>
+          </w:p>
+        </w:tc>
+      </w:tr>
+    </w:tbl>
+    <w:p>
+      <w:pPr>
+        <w:pStyle w:val="Zkladntext"/>
+      </w:pPr>
+      <w:r>
+        <w:t xml:space="preserve"/>
+      </w:r>
+    </w:p>
+    <w:p>
+      <w:pPr>
+        <w:pStyle w:val="Zkladntext"/>
+      </w:pPr>
+      <w:r>
+        <w:t xml:space="preserve">Ročná úspora pracovného času sa vypočíta ako súčin počtu zmien v harmonograme, času potrebného na ručný prepočet a hodinovej sadzby. Proti nej stoja ročné náklady na prevádzku a jednorazové náklady na zavedenie.</w:t>
+      </w:r>
+    </w:p>
+    <w:p>
+      <w:pPr>
+        <w:pStyle w:val="Zkladntext"/>
+      </w:pPr>
+      <w:r>
+        <w:t xml:space="preserve">Doba návratnosti je podiel jednorazových nákladov a rozdielu medzi ročnou úsporou a ročnými prevádzkovými nákladmi. Ak je tento rozdiel záporný, riešenie sa pri daných predpokladoch nevráti — aj tento výsledok je platný a treba ho uviesť.</w:t>
+      </w:r>
+    </w:p>
+    <w:p>
+      <w:pPr>
+        <w:pStyle w:val="Zkladntext"/>
+      </w:pPr>
+      <w:r>
+        <w:t xml:space="preserve">Keďže úspora času je odhad, výsledok sa neuvádza ako jediné číslo, ale v troch scenároch, ktoré sa líšia predpokladaným časom ručného prepočtu:</w:t>
+      </w:r>
+    </w:p>
+    <w:p>
+      <w:pPr>
+        <w:pStyle w:val="Titulek"/>
+      </w:pPr>
+      <w:r>
+        <w:t xml:space="preserve">Tab. 8.3 [doplniť popis tabuľky]</w:t>
+      </w:r>
+    </w:p>
+    <w:tbl>
+      <w:tblPr>
+        <w:tblW w:w="9068" w:type="dxa"/>
+        <w:tblLayout w:type="fixed"/>
+        <w:tblBorders>
+          <w:top w:val="single" w:sz="4" w:space="0" w:color="auto"/>
+          <w:left w:val="single" w:sz="4" w:space="0" w:color="auto"/>
+          <w:bottom w:val="single" w:sz="4" w:space="0" w:color="auto"/>
+          <w:right w:val="single" w:sz="4" w:space="0" w:color="auto"/>
+          <w:insideH w:val="single" w:sz="4" w:space="0" w:color="auto"/>
+          <w:insideV w:val="single" w:sz="4" w:space="0" w:color="auto"/>
+        </w:tblBorders>
+        <w:tblLook w:val="04A0" w:firstRow="1" w:lastRow="0" w:firstColumn="1" w:lastColumn="0" w:noHBand="0" w:noVBand="1"/>
+      </w:tblPr>
+      <w:tblGrid>
+        <w:gridCol w:w="2539"/>
+        <w:gridCol w:w="2176"/>
+        <w:gridCol w:w="1995"/>
+        <w:gridCol w:w="2358"/>
+      </w:tblGrid>
+      <w:tr>
+        <w:trPr>
+          <w:tblHeader/>
+        </w:trPr>
+        <w:tc>
+          <w:tcPr>
+            <w:tcW w:w="2539" w:type="dxa"/>
+          </w:tcPr>
+          <w:p>
+            <w:pPr>
+              <w:pStyle w:val="Zkladntext"/>
+              <w:ind w:firstLine="0" w:left="0" w:right="0"/>
+              <w:spacing w:before="20" w:after="20" w:line="240" w:lineRule="auto"/>
+              <w:jc w:val="center"/>
+            </w:pPr>
+            <w:r>
+              <w:rPr>
+                <w:b/>
+              </w:rPr>
+              <w:t xml:space="preserve">Scenár</w:t>
+            </w:r>
+          </w:p>
+        </w:tc>
+        <w:tc>
+          <w:tcPr>
+            <w:tcW w:w="2176" w:type="dxa"/>
+          </w:tcPr>
+          <w:p>
+            <w:pPr>
+              <w:pStyle w:val="Zkladntext"/>
+              <w:ind w:firstLine="0" w:left="0" w:right="0"/>
+              <w:spacing w:before="20" w:after="20" w:line="240" w:lineRule="auto"/>
+              <w:jc w:val="center"/>
+            </w:pPr>
+            <w:r>
+              <w:rPr>
+                <w:b/>
+              </w:rPr>
+              <w:t xml:space="preserve">Predpoklad</w:t>
+            </w:r>
+          </w:p>
+        </w:tc>
+        <w:tc>
+          <w:tcPr>
+            <w:tcW w:w="1995" w:type="dxa"/>
+          </w:tcPr>
+          <w:p>
+            <w:pPr>
+              <w:pStyle w:val="Zkladntext"/>
+              <w:ind w:firstLine="0" w:left="0" w:right="0"/>
+              <w:spacing w:before="20" w:after="20" w:line="240" w:lineRule="auto"/>
+              <w:jc w:val="center"/>
+            </w:pPr>
+            <w:r>
+              <w:rPr>
+                <w:b/>
+              </w:rPr>
+              <w:t xml:space="preserve">Ročná úspora</w:t>
+            </w:r>
+          </w:p>
+        </w:tc>
+        <w:tc>
+          <w:tcPr>
+            <w:tcW w:w="2358" w:type="dxa"/>
+          </w:tcPr>
+          <w:p>
+            <w:pPr>
+              <w:pStyle w:val="Zkladntext"/>
+              <w:ind w:firstLine="0" w:left="0" w:right="0"/>
+              <w:spacing w:before="20" w:after="20" w:line="240" w:lineRule="auto"/>
+              <w:jc w:val="center"/>
+            </w:pPr>
+            <w:r>
+              <w:rPr>
+                <w:b/>
+              </w:rPr>
+              <w:t xml:space="preserve">Doba návratnosti</w:t>
+            </w:r>
+          </w:p>
+        </w:tc>
+      </w:tr>
+      <w:tr>
+        <w:tc>
+          <w:tcPr>
+            <w:tcW w:w="2539" w:type="dxa"/>
+          </w:tcPr>
+          <w:p>
+            <w:pPr>
+              <w:pStyle w:val="Zkladntext"/>
+              <w:ind w:firstLine="0" w:left="0" w:right="0"/>
+              <w:spacing w:before="20" w:after="20" w:line="240" w:lineRule="auto"/>
+              <w:jc w:val="center"/>
+            </w:pPr>
+            <w:r>
+              <w:t xml:space="preserve">Pesimistický</w:t>
+            </w:r>
+          </w:p>
+        </w:tc>
+        <w:tc>
+          <w:tcPr>
+            <w:tcW w:w="2176" w:type="dxa"/>
+          </w:tcPr>
+          <w:p>
+            <w:pPr>
+              <w:pStyle w:val="Zkladntext"/>
+              <w:ind w:firstLine="0" w:left="0" w:right="0"/>
+              <w:spacing w:before="20" w:after="20" w:line="240" w:lineRule="auto"/>
+              <w:jc w:val="center"/>
+            </w:pPr>
+            <w:r>
+              <w:t xml:space="preserve">[doplniť]</w:t>
+            </w:r>
+          </w:p>
+        </w:tc>
+        <w:tc>
+          <w:tcPr>
+            <w:tcW w:w="1995" w:type="dxa"/>
+          </w:tcPr>
+          <w:p>
+            <w:pPr>
+              <w:pStyle w:val="Zkladntext"/>
+              <w:ind w:firstLine="0" w:left="0" w:right="0"/>
+              <w:spacing w:before="20" w:after="20" w:line="240" w:lineRule="auto"/>
+              <w:jc w:val="center"/>
+            </w:pPr>
+            <w:r>
+              <w:t xml:space="preserve">[doplniť]</w:t>
+            </w:r>
+          </w:p>
+        </w:tc>
+        <w:tc>
+          <w:tcPr>
+            <w:tcW w:w="2358" w:type="dxa"/>
+          </w:tcPr>
+          <w:p>
+            <w:pPr>
+              <w:pStyle w:val="Zkladntext"/>
+              <w:ind w:firstLine="0" w:left="0" w:right="0"/>
+              <w:spacing w:before="20" w:after="20" w:line="240" w:lineRule="auto"/>
+              <w:jc w:val="center"/>
+            </w:pPr>
+            <w:r>
+              <w:t xml:space="preserve">[doplniť]</w:t>
+            </w:r>
+          </w:p>
+        </w:tc>
+      </w:tr>
+      <w:tr>
+        <w:tc>
+          <w:tcPr>
+            <w:tcW w:w="2539" w:type="dxa"/>
+          </w:tcPr>
+          <w:p>
+            <w:pPr>
+              <w:pStyle w:val="Zkladntext"/>
+              <w:ind w:firstLine="0" w:left="0" w:right="0"/>
+              <w:spacing w:before="20" w:after="20" w:line="240" w:lineRule="auto"/>
+              <w:jc w:val="center"/>
+            </w:pPr>
+            <w:r>
+              <w:t xml:space="preserve">Realistický</w:t>
+            </w:r>
+          </w:p>
+        </w:tc>
+        <w:tc>
+          <w:tcPr>
+            <w:tcW w:w="2176" w:type="dxa"/>
+          </w:tcPr>
+          <w:p>
+            <w:pPr>
+              <w:pStyle w:val="Zkladntext"/>
+              <w:ind w:firstLine="0" w:left="0" w:right="0"/>
+              <w:spacing w:before="20" w:after="20" w:line="240" w:lineRule="auto"/>
+              <w:jc w:val="center"/>
+            </w:pPr>
+            <w:r>
+              <w:t xml:space="preserve">[doplniť]</w:t>
+            </w:r>
+          </w:p>
+        </w:tc>
+        <w:tc>
+          <w:tcPr>
+            <w:tcW w:w="1995" w:type="dxa"/>
+          </w:tcPr>
+          <w:p>
+            <w:pPr>
+              <w:pStyle w:val="Zkladntext"/>
+              <w:ind w:firstLine="0" w:left="0" w:right="0"/>
+              <w:spacing w:before="20" w:after="20" w:line="240" w:lineRule="auto"/>
+              <w:jc w:val="center"/>
+            </w:pPr>
+            <w:r>
+              <w:t xml:space="preserve">[doplniť]</w:t>
+            </w:r>
+          </w:p>
+        </w:tc>
+        <w:tc>
+          <w:tcPr>
+            <w:tcW w:w="2358" w:type="dxa"/>
+          </w:tcPr>
+          <w:p>
+            <w:pPr>
+              <w:pStyle w:val="Zkladntext"/>
+              <w:ind w:firstLine="0" w:left="0" w:right="0"/>
+              <w:spacing w:before="20" w:after="20" w:line="240" w:lineRule="auto"/>
+              <w:jc w:val="center"/>
+            </w:pPr>
+            <w:r>
+              <w:t xml:space="preserve">[doplniť]</w:t>
+            </w:r>
+          </w:p>
+        </w:tc>
+      </w:tr>
+      <w:tr>
+        <w:tc>
+          <w:tcPr>
+            <w:tcW w:w="2539" w:type="dxa"/>
+          </w:tcPr>
+          <w:p>
+            <w:pPr>
+              <w:pStyle w:val="Zkladntext"/>
+              <w:ind w:firstLine="0" w:left="0" w:right="0"/>
+              <w:spacing w:before="20" w:after="20" w:line="240" w:lineRule="auto"/>
+              <w:jc w:val="center"/>
+            </w:pPr>
+            <w:r>
+              <w:t xml:space="preserve">Optimistický</w:t>
+            </w:r>
+          </w:p>
+        </w:tc>
+        <w:tc>
+          <w:tcPr>
+            <w:tcW w:w="2176" w:type="dxa"/>
+          </w:tcPr>
+          <w:p>
+            <w:pPr>
+              <w:pStyle w:val="Zkladntext"/>
+              <w:ind w:firstLine="0" w:left="0" w:right="0"/>
+              <w:spacing w:before="20" w:after="20" w:line="240" w:lineRule="auto"/>
+              <w:jc w:val="center"/>
+            </w:pPr>
+            <w:r>
+              <w:t xml:space="preserve">[doplniť]</w:t>
+            </w:r>
+          </w:p>
+        </w:tc>
+        <w:tc>
+          <w:tcPr>
+            <w:tcW w:w="1995" w:type="dxa"/>
+          </w:tcPr>
+          <w:p>
+            <w:pPr>
+              <w:pStyle w:val="Zkladntext"/>
+              <w:ind w:firstLine="0" w:left="0" w:right="0"/>
+              <w:spacing w:before="20" w:after="20" w:line="240" w:lineRule="auto"/>
+              <w:jc w:val="center"/>
+            </w:pPr>
+            <w:r>
+              <w:t xml:space="preserve">[doplniť]</w:t>
+            </w:r>
+          </w:p>
+        </w:tc>
+        <w:tc>
+          <w:tcPr>
+            <w:tcW w:w="2358" w:type="dxa"/>
+          </w:tcPr>
+          <w:p>
+            <w:pPr>
+              <w:pStyle w:val="Zkladntext"/>
+              <w:ind w:firstLine="0" w:left="0" w:right="0"/>
+              <w:spacing w:before="20" w:after="20" w:line="240" w:lineRule="auto"/>
+              <w:jc w:val="center"/>
+            </w:pPr>
+            <w:r>
+              <w:t xml:space="preserve">[doplniť]</w:t>
+            </w:r>
+          </w:p>
+        </w:tc>
+      </w:tr>
+    </w:tbl>
+    <w:p>
+      <w:pPr>
+        <w:pStyle w:val="Zkladntext"/>
+      </w:pPr>
+      <w:r>
+        <w:t xml:space="preserve"/>
+      </w:r>
+    </w:p>
+    <w:p>
+      <w:pPr>
+        <w:pStyle w:val="Zkladntext"/>
+      </w:pPr>
+      <w:r>
         <w:rPr>
           <w:b/>
           <w:highlight w:val="yellow"/>
@@ -20851,7 +21935,7 @@
         <w:rPr>
           <w:highlight w:val="yellow"/>
         </w:rPr>
-        <w:t xml:space="preserve">Napísať nanovo — konkrétny scenár: počet zamestnancov, projektov a hodinová sadzba. Porovnať súčasný spôsob plánovania proti zavedeniu systému.</w:t>
+        <w:t xml:space="preserve">Doplniť vstupné hodnoty, prepočítať tabuľku scenárov a uviesť postup výpočtu tak, aby sa dal overiť. Vstupy, ktoré nie sú doložiteľné cenníkom, označiť ako odhad a v závere kapitoly zopakovať medzi obmedzeniami.</w:t>
       </w:r>
     </w:p>
     <w:p>
@@ -20893,7 +21977,7 @@
         <w:pStyle w:val="Titulek"/>
       </w:pPr>
       <w:r>
-        <w:t xml:space="preserve">Tab. 8.2 [doplniť popis tabuľky]</w:t>
+        <w:t xml:space="preserve">Tab. 8.4 [doplniť popis tabuľky]</w:t>
       </w:r>
     </w:p>
     <w:tbl>

</xml_diff>

<commit_message>
docs(bp): rešerš konkurencie, mail garantovi a modul ako aplikačný príklad
Rešerš piatich nástrojov s tabuľkou porovnania. Zámerne obsahuje aj štyri riadky,
v ktorých Nodus prehráva — automatizácie, napojenia, mobilná aplikácia a formuláre.
Bez nich by porovnanie pôsobilo ako reklama, pred čím vedúca varovala. Argument
nie je väčší rozsah funkcií, ale že rozšírené nástroje nemajú výpočet kritickej
cesty vôbec.

Modul pre finančných poradcov je v práci podaný ako aplikačný príklad prenositeľnosti
riešenia, nie ako druhá nosná téma. Text vysvetľuje aj to, prečo sú úlohy voči
klientovi vedené oddelene od projektových — ich zlúčenie by skreslilo výpočet.

Pridaný návrh mailu garantovi odboru so žiadosťou o posúdenie funkčnosti.

Co-Authored-By: Claude Opus 5 <noreply@anthropic.com>
</commit_message>
<xml_diff>
--- a/docs/Bakalarska_praca_Serafin.docx
+++ b/docs/Bakalarska_praca_Serafin.docx
@@ -11133,6 +11133,38 @@
         <w:pStyle w:val="Zkladntext"/>
       </w:pPr>
       <w:r>
+        <w:t xml:space="preserve">Jadro systému — plánovanie činností a výpočet kritickej cesty — nie je viazané na konkrétne odvetvie. Aby sa dala overiť prenositeľnosť riešenia, bol pre jednu konkrétnu oblasť doplnený modul nad týmto jadrom. Zvolenou oblasťou je finančné poradenstvo, pretože z konzultácie s odborníkom z praxe boli známe jej požiadavky.</w:t>
+      </w:r>
+    </w:p>
+    <w:p>
+      <w:pPr>
+        <w:pStyle w:val="Zkladntext"/>
+      </w:pPr>
+      <w:r>
+        <w:t xml:space="preserve">Modul pridáva evidenciu klientov, kontrolný zoznam povinností vyplývajúcich z regulácie, fázy rozpracovanosti obchodu, záznam interakcií s klientom a úlohy naplánované voči nemu. Projekty sa dajú ku klientovi priradiť, takže harmonogram a kontext klienta zostávajú prepojené.</w:t>
+      </w:r>
+    </w:p>
+    <w:p>
+      <w:pPr>
+        <w:pStyle w:val="Zkladntext"/>
+      </w:pPr>
+      <w:r>
+        <w:t xml:space="preserve">Podstatné pre návrh je, že úlohy naplánované voči klientovi sú vedené oddelene od projektových. Projektová úloha má trvanie a závislosti a vstupuje do výpočtu kritickej cesty; úloha voči klientovi ani jedno nemá a do harmonogramu nepatrí. Ich zlúčenie do jednej entity by skreslilo výpočet, ktorý je predmetom práce.</w:t>
+      </w:r>
+    </w:p>
+    <w:p>
+      <w:pPr>
+        <w:pStyle w:val="Zkladntext"/>
+      </w:pPr>
+      <w:r>
+        <w:t xml:space="preserve">Modul zároveň ukazuje hranicu riešenia. Kontrolný zoznam môže podporovať plnenie povinností a preukazovanie, že boli vykonané, ale zo samotnej funkcionality nemožno odvodzovať zaistenie regulatórneho súladu — ten závisí od postupov organizácie, nie od nástroja.</w:t>
+      </w:r>
+    </w:p>
+    <w:p>
+      <w:pPr>
+        <w:pStyle w:val="Zkladntext"/>
+      </w:pPr>
+      <w:r>
         <w:rPr>
           <w:b/>
           <w:highlight w:val="yellow"/>
@@ -11143,7 +11175,7 @@
         <w:rPr>
           <w:highlight w:val="yellow"/>
         </w:rPr>
-        <w:t xml:space="preserve">Výrazne skrátiť a zlúčiť. Modul pre finančných poradcov uviesť len ako aplikačný príklad využitia systému, nie ako samostatnú tému. Tvrdenie o MiFID II preformulovať — kontrolný zoznam plnenie povinností podporuje, ale regulatórnu zhodu sám o sebe nezaisťuje. Stručne doplniť GDPR a uchovávanie dokumentov.</w:t>
+        <w:t xml:space="preserve">Doplniť odkaz na príslušnú právnu úpravu a odborný zdroj k MiFID II. Stručne doplniť aj nakladanie s osobnými údajmi podľa GDPR a uchovávanie dokumentov — ide o citlivé údaje klientov.</w:t>
       </w:r>
     </w:p>
     <w:p>

</xml_diff>